<commit_message>
Finish Noti & TR
</commit_message>
<xml_diff>
--- a/SRS/SRS.docx
+++ b/SRS/SRS.docx
@@ -1,6 +1,6 @@
 
 <file path=word/document.xml><?xml version="1.0" encoding="utf-8"?>
-<w:document xmlns:wpc="http://schemas.microsoft.com/office/word/2010/wordprocessingCanvas" xmlns:cx="http://schemas.microsoft.com/office/drawing/2014/chartex" xmlns:cx1="http://schemas.microsoft.com/office/drawing/2015/9/8/chartex" xmlns:cx2="http://schemas.microsoft.com/office/drawing/2015/10/21/chartex" xmlns:cx3="http://schemas.microsoft.com/office/drawing/2016/5/9/chartex" xmlns:cx4="http://schemas.microsoft.com/office/drawing/2016/5/10/chartex" xmlns:cx5="http://schemas.microsoft.com/office/drawing/2016/5/11/chartex" xmlns:cx6="http://schemas.microsoft.com/office/drawing/2016/5/12/chartex" xmlns:cx7="http://schemas.microsoft.com/office/drawing/2016/5/13/chartex" xmlns:cx8="http://schemas.microsoft.com/office/drawing/2016/5/14/chartex" xmlns:mc="http://schemas.openxmlformats.org/markup-compatibility/2006" xmlns:aink="http://schemas.microsoft.com/office/drawing/2016/ink" xmlns:am3d="http://schemas.microsoft.com/office/drawing/2017/model3d" xmlns:o="urn:schemas-microsoft-com:office:office" xmlns:r="http://schemas.openxmlformats.org/officeDocument/2006/relationships" xmlns:m="http://schemas.openxmlformats.org/officeDocument/2006/math" xmlns:v="urn:schemas-microsoft-com:vml" xmlns:wp14="http://schemas.microsoft.com/office/word/2010/wordprocessingDrawing" xmlns:wp="http://schemas.openxmlformats.org/drawingml/2006/wordprocessingDrawing" xmlns:w10="urn:schemas-microsoft-com:office:word" xmlns:w="http://schemas.openxmlformats.org/wordprocessingml/2006/main" xmlns:w14="http://schemas.microsoft.com/office/word/2010/wordml" xmlns:w15="http://schemas.microsoft.com/office/word/2012/wordml" xmlns:w16cex="http://schemas.microsoft.com/office/word/2018/wordml/cex" xmlns:w16cid="http://schemas.microsoft.com/office/word/2016/wordml/cid" xmlns:w16="http://schemas.microsoft.com/office/word/2018/wordml" xmlns:w16se="http://schemas.microsoft.com/office/word/2015/wordml/symex" xmlns:wpg="http://schemas.microsoft.com/office/word/2010/wordprocessingGroup" xmlns:wpi="http://schemas.microsoft.com/office/word/2010/wordprocessingInk" xmlns:wne="http://schemas.microsoft.com/office/word/2006/wordml" xmlns:wps="http://schemas.microsoft.com/office/word/2010/wordprocessingShape" mc:Ignorable="w14 w15 w16se w16cid w16 w16cex wp14">
+<w:document xmlns:wpc="http://schemas.microsoft.com/office/word/2010/wordprocessingCanvas" xmlns:cx="http://schemas.microsoft.com/office/drawing/2014/chartex" xmlns:cx1="http://schemas.microsoft.com/office/drawing/2015/9/8/chartex" xmlns:mc="http://schemas.openxmlformats.org/markup-compatibility/2006" xmlns:o="urn:schemas-microsoft-com:office:office" xmlns:r="http://schemas.openxmlformats.org/officeDocument/2006/relationships" xmlns:m="http://schemas.openxmlformats.org/officeDocument/2006/math" xmlns:v="urn:schemas-microsoft-com:vml" xmlns:wp14="http://schemas.microsoft.com/office/word/2010/wordprocessingDrawing" xmlns:wp="http://schemas.openxmlformats.org/drawingml/2006/wordprocessingDrawing" xmlns:w10="urn:schemas-microsoft-com:office:word" xmlns:w="http://schemas.openxmlformats.org/wordprocessingml/2006/main" xmlns:w14="http://schemas.microsoft.com/office/word/2010/wordml" xmlns:w15="http://schemas.microsoft.com/office/word/2012/wordml" xmlns:w16se="http://schemas.microsoft.com/office/word/2015/wordml/symex" xmlns:wpg="http://schemas.microsoft.com/office/word/2010/wordprocessingGroup" xmlns:wpi="http://schemas.microsoft.com/office/word/2010/wordprocessingInk" xmlns:wne="http://schemas.microsoft.com/office/word/2006/wordml" xmlns:wps="http://schemas.microsoft.com/office/word/2010/wordprocessingShape" mc:Ignorable="w14 w15 w16se wp14">
   <w:background w:color="FFFFFF" w:themeColor="background1"/>
   <w:body>
     <w:p>
@@ -1147,7 +1147,31 @@
           <w:sz w:val="24"/>
           <w:szCs w:val="24"/>
         </w:rPr>
-        <w:t>...............................................................................................................4</w:t>
+        <w:t>..................................................................................................</w:t>
+      </w:r>
+      <w:r>
+        <w:rPr>
+          <w:rFonts w:ascii="Bahnschrift" w:eastAsia="Times New Roman" w:hAnsi="Bahnschrift" w:cs="Times"/>
+          <w:b/>
+          <w:bCs/>
+          <w:color w:val="000000"/>
+          <w:sz w:val="24"/>
+          <w:szCs w:val="24"/>
+        </w:rPr>
+        <w:t>..............................</w:t>
+      </w:r>
+      <w:bookmarkStart w:id="0" w:name="_GoBack"/>
+      <w:bookmarkEnd w:id="0"/>
+      <w:r>
+        <w:rPr>
+          <w:rFonts w:ascii="Bahnschrift" w:eastAsia="Times New Roman" w:hAnsi="Bahnschrift" w:cs="Times"/>
+          <w:b/>
+          <w:bCs/>
+          <w:color w:val="000000"/>
+          <w:sz w:val="24"/>
+          <w:szCs w:val="24"/>
+        </w:rPr>
+        <w:t>.5</w:t>
       </w:r>
     </w:p>
     <w:p>
@@ -1312,7 +1336,17 @@
           <w:sz w:val="24"/>
           <w:szCs w:val="24"/>
         </w:rPr>
-        <w:t xml:space="preserve">2.6 Project Documentation </w:t>
+        <w:t xml:space="preserve">2.6 Project </w:t>
+      </w:r>
+      <w:proofErr w:type="gramStart"/>
+      <w:r>
+        <w:rPr>
+          <w:rFonts w:ascii="Bahnschrift" w:eastAsia="Times New Roman" w:hAnsi="Bahnschrift" w:cs="Times New Roman"/>
+          <w:color w:val="000000"/>
+          <w:sz w:val="24"/>
+          <w:szCs w:val="24"/>
+        </w:rPr>
+        <w:t xml:space="preserve">Documentation </w:t>
       </w:r>
       <w:r>
         <w:rPr>
@@ -1321,7 +1355,17 @@
           <w:sz w:val="24"/>
           <w:szCs w:val="24"/>
         </w:rPr>
-        <w:t>.............................................................................................................. 11</w:t>
+        <w:t>..............................................................................................................</w:t>
+      </w:r>
+      <w:proofErr w:type="gramEnd"/>
+      <w:r>
+        <w:rPr>
+          <w:rFonts w:ascii="Bahnschrift" w:eastAsia="Times New Roman" w:hAnsi="Bahnschrift" w:cs="Times"/>
+          <w:color w:val="000000"/>
+          <w:sz w:val="24"/>
+          <w:szCs w:val="24"/>
+        </w:rPr>
+        <w:t xml:space="preserve"> 11</w:t>
       </w:r>
     </w:p>
     <w:p>
@@ -1576,14 +1620,30 @@
           <w:rFonts w:ascii="Bahnschrift" w:eastAsia="Times New Roman" w:hAnsi="Bahnschrift" w:cs="Times New Roman"/>
           <w:color w:val="000000"/>
         </w:rPr>
-        <w:t xml:space="preserve">4.2 Use Case Diagram </w:t>
+        <w:t xml:space="preserve">4.2 Use Case </w:t>
+      </w:r>
+      <w:proofErr w:type="gramStart"/>
+      <w:r>
+        <w:rPr>
+          <w:rFonts w:ascii="Bahnschrift" w:eastAsia="Times New Roman" w:hAnsi="Bahnschrift" w:cs="Times New Roman"/>
+          <w:color w:val="000000"/>
+        </w:rPr>
+        <w:t xml:space="preserve">Diagram </w:t>
       </w:r>
       <w:r>
         <w:rPr>
           <w:rFonts w:ascii="Bahnschrift" w:eastAsia="Times New Roman" w:hAnsi="Bahnschrift" w:cs="Times"/>
           <w:color w:val="000000"/>
         </w:rPr>
-        <w:t>.................................................................................................................... 19</w:t>
+        <w:t>....................................................................................................................</w:t>
+      </w:r>
+      <w:proofErr w:type="gramEnd"/>
+      <w:r>
+        <w:rPr>
+          <w:rFonts w:ascii="Bahnschrift" w:eastAsia="Times New Roman" w:hAnsi="Bahnschrift" w:cs="Times"/>
+          <w:color w:val="000000"/>
+        </w:rPr>
+        <w:t xml:space="preserve"> 19</w:t>
       </w:r>
     </w:p>
     <w:p>
@@ -2184,7 +2244,29 @@
           <w:sz w:val="24"/>
           <w:szCs w:val="24"/>
         </w:rPr>
-        <w:t xml:space="preserve">AI Chatbot &amp; </w:t>
+        <w:t xml:space="preserve">AI </w:t>
+      </w:r>
+      <w:proofErr w:type="spellStart"/>
+      <w:r>
+        <w:rPr>
+          <w:rFonts w:ascii="Bahnschrift" w:eastAsia="Times New Roman" w:hAnsi="Bahnschrift" w:cs="Times New Roman"/>
+          <w:b/>
+          <w:bCs/>
+          <w:sz w:val="24"/>
+          <w:szCs w:val="24"/>
+        </w:rPr>
+        <w:t>Chatbot</w:t>
+      </w:r>
+      <w:proofErr w:type="spellEnd"/>
+      <w:r>
+        <w:rPr>
+          <w:rFonts w:ascii="Bahnschrift" w:eastAsia="Times New Roman" w:hAnsi="Bahnschrift" w:cs="Times New Roman"/>
+          <w:b/>
+          <w:bCs/>
+          <w:sz w:val="24"/>
+          <w:szCs w:val="24"/>
+        </w:rPr>
+        <w:t xml:space="preserve"> &amp; </w:t>
       </w:r>
       <w:proofErr w:type="spellStart"/>
       <w:r>
@@ -3481,8 +3563,20 @@
           <w:sz w:val="24"/>
           <w:szCs w:val="24"/>
         </w:rPr>
-        <w:t>Presentation Layer (Frontend):</w:t>
-      </w:r>
+        <w:t>Presentation Layer (Frontend)</w:t>
+      </w:r>
+      <w:proofErr w:type="gramStart"/>
+      <w:r>
+        <w:rPr>
+          <w:rFonts w:ascii="Bahnschrift" w:eastAsia="Times New Roman" w:hAnsi="Bahnschrift" w:cs="Times New Roman"/>
+          <w:b/>
+          <w:bCs/>
+          <w:sz w:val="24"/>
+          <w:szCs w:val="24"/>
+        </w:rPr>
+        <w:t>:</w:t>
+      </w:r>
+      <w:proofErr w:type="gramEnd"/>
       <w:r>
         <w:rPr>
           <w:rFonts w:ascii="Bahnschrift" w:eastAsia="Times New Roman" w:hAnsi="Bahnschrift" w:cs="Times New Roman"/>
@@ -3514,8 +3608,20 @@
           <w:sz w:val="24"/>
           <w:szCs w:val="24"/>
         </w:rPr>
-        <w:t>Application Layer (Backend Services):</w:t>
-      </w:r>
+        <w:t>Application Layer (Backend Services)</w:t>
+      </w:r>
+      <w:proofErr w:type="gramStart"/>
+      <w:r>
+        <w:rPr>
+          <w:rFonts w:ascii="Bahnschrift" w:eastAsia="Times New Roman" w:hAnsi="Bahnschrift" w:cs="Times New Roman"/>
+          <w:b/>
+          <w:bCs/>
+          <w:sz w:val="24"/>
+          <w:szCs w:val="24"/>
+        </w:rPr>
+        <w:t>:</w:t>
+      </w:r>
+      <w:proofErr w:type="gramEnd"/>
       <w:r>
         <w:rPr>
           <w:rFonts w:ascii="Bahnschrift" w:eastAsia="Times New Roman" w:hAnsi="Bahnschrift" w:cs="Times New Roman"/>
@@ -3547,8 +3653,20 @@
           <w:sz w:val="24"/>
           <w:szCs w:val="24"/>
         </w:rPr>
-        <w:t>Data Layer:</w:t>
-      </w:r>
+        <w:t>Data Layer</w:t>
+      </w:r>
+      <w:proofErr w:type="gramStart"/>
+      <w:r>
+        <w:rPr>
+          <w:rFonts w:ascii="Bahnschrift" w:eastAsia="Times New Roman" w:hAnsi="Bahnschrift" w:cs="Times New Roman"/>
+          <w:b/>
+          <w:bCs/>
+          <w:sz w:val="24"/>
+          <w:szCs w:val="24"/>
+        </w:rPr>
+        <w:t>:</w:t>
+      </w:r>
+      <w:proofErr w:type="gramEnd"/>
       <w:r>
         <w:rPr>
           <w:rFonts w:ascii="Bahnschrift" w:eastAsia="Times New Roman" w:hAnsi="Bahnschrift" w:cs="Times New Roman"/>
@@ -3686,7 +3804,25 @@
           <w:sz w:val="24"/>
           <w:szCs w:val="24"/>
         </w:rPr>
-        <w:t xml:space="preserve"> (AI Chatbot and </w:t>
+        <w:t xml:space="preserve"> (AI </w:t>
+      </w:r>
+      <w:proofErr w:type="spellStart"/>
+      <w:r>
+        <w:rPr>
+          <w:rFonts w:ascii="Bahnschrift" w:eastAsia="Times New Roman" w:hAnsi="Bahnschrift" w:cs="Times New Roman"/>
+          <w:sz w:val="24"/>
+          <w:szCs w:val="24"/>
+        </w:rPr>
+        <w:t>Chatbot</w:t>
+      </w:r>
+      <w:proofErr w:type="spellEnd"/>
+      <w:r>
+        <w:rPr>
+          <w:rFonts w:ascii="Bahnschrift" w:eastAsia="Times New Roman" w:hAnsi="Bahnschrift" w:cs="Times New Roman"/>
+          <w:sz w:val="24"/>
+          <w:szCs w:val="24"/>
+        </w:rPr>
+        <w:t xml:space="preserve"> and </w:t>
       </w:r>
       <w:proofErr w:type="spellStart"/>
       <w:r>
@@ -3736,7 +3872,25 @@
           <w:sz w:val="24"/>
           <w:szCs w:val="24"/>
         </w:rPr>
-        <w:t xml:space="preserve"> (e.g., WebRTC / </w:t>
+        <w:t xml:space="preserve"> (e.g., </w:t>
+      </w:r>
+      <w:proofErr w:type="spellStart"/>
+      <w:r>
+        <w:rPr>
+          <w:rFonts w:ascii="Bahnschrift" w:eastAsia="Times New Roman" w:hAnsi="Bahnschrift" w:cs="Times New Roman"/>
+          <w:sz w:val="24"/>
+          <w:szCs w:val="24"/>
+        </w:rPr>
+        <w:t>WebRTC</w:t>
+      </w:r>
+      <w:proofErr w:type="spellEnd"/>
+      <w:r>
+        <w:rPr>
+          <w:rFonts w:ascii="Bahnschrift" w:eastAsia="Times New Roman" w:hAnsi="Bahnschrift" w:cs="Times New Roman"/>
+          <w:sz w:val="24"/>
+          <w:szCs w:val="24"/>
+        </w:rPr>
+        <w:t xml:space="preserve"> / </w:t>
       </w:r>
       <w:proofErr w:type="spellStart"/>
       <w:r>
@@ -4227,6 +4381,14 @@
     </w:p>
     <w:p>
       <w:pPr>
+        <w:spacing w:before="100" w:beforeAutospacing="1" w:after="100" w:afterAutospacing="1" w:line="240" w:lineRule="auto"/>
+        <w:rPr>
+          <w:rFonts w:ascii="Bahnschrift" w:eastAsia="Times New Roman" w:hAnsi="Bahnschrift" w:cs="Times New Roman"/>
+          <w:sz w:val="24"/>
+          <w:szCs w:val="24"/>
+        </w:rPr>
+      </w:pPr>
+      <w:r>
         <w:rPr>
           <w:rFonts w:ascii="Bahnschrift" w:hAnsi="Bahnschrift" w:cs="Arial"/>
           <w:b/>
@@ -4235,8 +4397,342 @@
           <w:szCs w:val="28"/>
           <w:lang w:bidi="ar-EG"/>
         </w:rPr>
-      </w:pPr>
-      <w:r>
+        <w:t>2.3 User Classes and Characteristics</w:t>
+      </w:r>
+    </w:p>
+    <w:p>
+      <w:pPr>
+        <w:rPr>
+          <w:rFonts w:ascii="Bahnschrift" w:hAnsi="Bahnschrift" w:cs="Arial"/>
+          <w:b/>
+          <w:bCs/>
+          <w:sz w:val="24"/>
+          <w:szCs w:val="24"/>
+          <w:lang w:bidi="ar-EG"/>
+        </w:rPr>
+      </w:pPr>
+      <w:r>
+        <w:rPr>
+          <w:rFonts w:ascii="Bahnschrift" w:hAnsi="Bahnschrift" w:cs="Arial"/>
+          <w:b/>
+          <w:bCs/>
+          <w:sz w:val="24"/>
+          <w:szCs w:val="24"/>
+          <w:lang w:bidi="ar-EG"/>
+        </w:rPr>
+        <w:t>2.3.1 User Classes</w:t>
+      </w:r>
+    </w:p>
+    <w:p>
+      <w:pPr>
+        <w:rPr>
+          <w:rFonts w:ascii="Bahnschrift" w:hAnsi="Bahnschrift" w:cs="Arial"/>
+          <w:sz w:val="24"/>
+          <w:szCs w:val="24"/>
+          <w:lang w:bidi="ar-EG"/>
+        </w:rPr>
+      </w:pPr>
+      <w:r>
+        <w:rPr>
+          <w:rFonts w:ascii="Bahnschrift" w:hAnsi="Bahnschrift" w:cs="Arial"/>
+          <w:sz w:val="24"/>
+          <w:szCs w:val="24"/>
+          <w:lang w:bidi="ar-EG"/>
+        </w:rPr>
+        <w:t xml:space="preserve">The </w:t>
+      </w:r>
+      <w:proofErr w:type="spellStart"/>
+      <w:r>
+        <w:rPr>
+          <w:rFonts w:ascii="Bahnschrift" w:hAnsi="Bahnschrift" w:cs="Arial"/>
+          <w:sz w:val="24"/>
+          <w:szCs w:val="24"/>
+          <w:lang w:bidi="ar-EG"/>
+        </w:rPr>
+        <w:t>Athary</w:t>
+      </w:r>
+      <w:proofErr w:type="spellEnd"/>
+      <w:r>
+        <w:rPr>
+          <w:rFonts w:ascii="Bahnschrift" w:hAnsi="Bahnschrift" w:cs="Arial"/>
+          <w:sz w:val="24"/>
+          <w:szCs w:val="24"/>
+          <w:lang w:bidi="ar-EG"/>
+        </w:rPr>
+        <w:t xml:space="preserve"> system supports the following user classes:</w:t>
+      </w:r>
+    </w:p>
+    <w:p>
+      <w:pPr>
+        <w:rPr>
+          <w:rFonts w:ascii="Bahnschrift" w:hAnsi="Bahnschrift" w:cs="Arial"/>
+          <w:sz w:val="24"/>
+          <w:szCs w:val="24"/>
+          <w:lang w:bidi="ar-EG"/>
+        </w:rPr>
+      </w:pPr>
+      <w:r>
+        <w:rPr>
+          <w:rFonts w:ascii="Bahnschrift" w:hAnsi="Bahnschrift" w:cs="Arial"/>
+          <w:sz w:val="24"/>
+          <w:szCs w:val="24"/>
+          <w:lang w:bidi="ar-EG"/>
+        </w:rPr>
+        <w:t>• Student</w:t>
+      </w:r>
+    </w:p>
+    <w:p>
+      <w:pPr>
+        <w:rPr>
+          <w:rFonts w:ascii="Bahnschrift" w:hAnsi="Bahnschrift" w:cs="Arial"/>
+          <w:sz w:val="24"/>
+          <w:szCs w:val="24"/>
+          <w:lang w:bidi="ar-EG"/>
+        </w:rPr>
+      </w:pPr>
+      <w:r>
+        <w:rPr>
+          <w:rFonts w:ascii="Bahnschrift" w:hAnsi="Bahnschrift" w:cs="Arial"/>
+          <w:sz w:val="24"/>
+          <w:szCs w:val="24"/>
+          <w:lang w:bidi="ar-EG"/>
+        </w:rPr>
+        <w:t>• Instructor</w:t>
+      </w:r>
+    </w:p>
+    <w:p>
+      <w:pPr>
+        <w:rPr>
+          <w:rFonts w:ascii="Bahnschrift" w:hAnsi="Bahnschrift" w:cs="Arial"/>
+          <w:sz w:val="24"/>
+          <w:szCs w:val="24"/>
+          <w:lang w:bidi="ar-EG"/>
+        </w:rPr>
+      </w:pPr>
+      <w:r>
+        <w:rPr>
+          <w:rFonts w:ascii="Bahnschrift" w:hAnsi="Bahnschrift" w:cs="Arial"/>
+          <w:sz w:val="24"/>
+          <w:szCs w:val="24"/>
+          <w:lang w:bidi="ar-EG"/>
+        </w:rPr>
+        <w:t>• Assistant Instructor</w:t>
+      </w:r>
+    </w:p>
+    <w:p>
+      <w:pPr>
+        <w:rPr>
+          <w:rFonts w:ascii="Bahnschrift" w:hAnsi="Bahnschrift" w:cs="Arial"/>
+          <w:sz w:val="24"/>
+          <w:szCs w:val="24"/>
+          <w:lang w:bidi="ar-EG"/>
+        </w:rPr>
+      </w:pPr>
+      <w:r>
+        <w:rPr>
+          <w:rFonts w:ascii="Bahnschrift" w:hAnsi="Bahnschrift" w:cs="Arial"/>
+          <w:sz w:val="24"/>
+          <w:szCs w:val="24"/>
+          <w:lang w:bidi="ar-EG"/>
+        </w:rPr>
+        <w:t>• Administrator</w:t>
+      </w:r>
+    </w:p>
+    <w:p>
+      <w:pPr>
+        <w:rPr>
+          <w:rFonts w:ascii="Bahnschrift" w:hAnsi="Bahnschrift" w:cs="Arial"/>
+          <w:b/>
+          <w:bCs/>
+          <w:sz w:val="24"/>
+          <w:szCs w:val="24"/>
+          <w:lang w:bidi="ar-EG"/>
+        </w:rPr>
+      </w:pPr>
+      <w:r>
+        <w:rPr>
+          <w:rFonts w:ascii="Bahnschrift" w:hAnsi="Bahnschrift" w:cs="Arial"/>
+          <w:b/>
+          <w:bCs/>
+          <w:sz w:val="24"/>
+          <w:szCs w:val="24"/>
+          <w:lang w:bidi="ar-EG"/>
+        </w:rPr>
+        <w:t>2.3.2 Characteristics of User Classes</w:t>
+      </w:r>
+    </w:p>
+    <w:p>
+      <w:pPr>
+        <w:rPr>
+          <w:rFonts w:ascii="Bahnschrift" w:hAnsi="Bahnschrift" w:cs="Arial"/>
+          <w:sz w:val="24"/>
+          <w:szCs w:val="24"/>
+          <w:lang w:bidi="ar-EG"/>
+        </w:rPr>
+      </w:pPr>
+      <w:r>
+        <w:rPr>
+          <w:rFonts w:ascii="Bahnschrift" w:hAnsi="Bahnschrift" w:cs="Arial"/>
+          <w:sz w:val="24"/>
+          <w:szCs w:val="24"/>
+          <w:lang w:bidi="ar-EG"/>
+        </w:rPr>
+        <w:t>Student:</w:t>
+      </w:r>
+    </w:p>
+    <w:p>
+      <w:pPr>
+        <w:rPr>
+          <w:rFonts w:ascii="Bahnschrift" w:hAnsi="Bahnschrift" w:cs="Arial"/>
+          <w:sz w:val="24"/>
+          <w:szCs w:val="24"/>
+          <w:lang w:bidi="ar-EG"/>
+        </w:rPr>
+      </w:pPr>
+      <w:r>
+        <w:rPr>
+          <w:rFonts w:ascii="Bahnschrift" w:hAnsi="Bahnschrift" w:cs="Arial"/>
+          <w:sz w:val="24"/>
+          <w:szCs w:val="24"/>
+          <w:lang w:bidi="ar-EG"/>
+        </w:rPr>
+        <w:t>Students use the platform to enroll in courses, view educational content, attend live sessions, take quizzes, and obtain certificates.</w:t>
+      </w:r>
+    </w:p>
+    <w:p>
+      <w:pPr>
+        <w:rPr>
+          <w:rFonts w:ascii="Bahnschrift" w:hAnsi="Bahnschrift" w:cs="Arial"/>
+          <w:sz w:val="24"/>
+          <w:szCs w:val="24"/>
+          <w:lang w:bidi="ar-EG"/>
+        </w:rPr>
+      </w:pPr>
+      <w:r>
+        <w:rPr>
+          <w:rFonts w:ascii="Bahnschrift" w:hAnsi="Bahnschrift" w:cs="Arial"/>
+          <w:sz w:val="24"/>
+          <w:szCs w:val="24"/>
+          <w:lang w:bidi="ar-EG"/>
+        </w:rPr>
+        <w:t>Instructor:</w:t>
+      </w:r>
+    </w:p>
+    <w:p>
+      <w:pPr>
+        <w:rPr>
+          <w:rFonts w:ascii="Bahnschrift" w:hAnsi="Bahnschrift" w:cs="Arial"/>
+          <w:sz w:val="24"/>
+          <w:szCs w:val="24"/>
+          <w:lang w:bidi="ar-EG"/>
+        </w:rPr>
+      </w:pPr>
+      <w:r>
+        <w:rPr>
+          <w:rFonts w:ascii="Bahnschrift" w:hAnsi="Bahnschrift" w:cs="Arial"/>
+          <w:sz w:val="24"/>
+          <w:szCs w:val="24"/>
+          <w:lang w:bidi="ar-EG"/>
+        </w:rPr>
+        <w:t>Instructors create and manage courses, upload content, conduct live sessions, create assessments</w:t>
+      </w:r>
+      <w:r>
+        <w:rPr>
+          <w:rFonts w:ascii="Bahnschrift" w:hAnsi="Bahnschrift" w:cs="Arial"/>
+          <w:sz w:val="24"/>
+          <w:szCs w:val="24"/>
+          <w:lang w:bidi="ar-EG"/>
+        </w:rPr>
+        <w:t xml:space="preserve"> and quizzes</w:t>
+      </w:r>
+      <w:r>
+        <w:rPr>
+          <w:rFonts w:ascii="Bahnschrift" w:hAnsi="Bahnschrift" w:cs="Arial"/>
+          <w:sz w:val="24"/>
+          <w:szCs w:val="24"/>
+          <w:lang w:bidi="ar-EG"/>
+        </w:rPr>
+        <w:t>, and analyze student performance.</w:t>
+      </w:r>
+    </w:p>
+    <w:p>
+      <w:pPr>
+        <w:rPr>
+          <w:rFonts w:ascii="Bahnschrift" w:hAnsi="Bahnschrift" w:cs="Arial"/>
+          <w:sz w:val="24"/>
+          <w:szCs w:val="24"/>
+          <w:lang w:bidi="ar-EG"/>
+        </w:rPr>
+      </w:pPr>
+      <w:r>
+        <w:rPr>
+          <w:rFonts w:ascii="Bahnschrift" w:hAnsi="Bahnschrift" w:cs="Arial"/>
+          <w:sz w:val="24"/>
+          <w:szCs w:val="24"/>
+          <w:lang w:bidi="ar-EG"/>
+        </w:rPr>
+        <w:t>Assistant Instructor:</w:t>
+      </w:r>
+    </w:p>
+    <w:p>
+      <w:pPr>
+        <w:rPr>
+          <w:rFonts w:ascii="Bahnschrift" w:hAnsi="Bahnschrift" w:cs="Arial"/>
+          <w:sz w:val="24"/>
+          <w:szCs w:val="24"/>
+          <w:lang w:bidi="ar-EG"/>
+        </w:rPr>
+      </w:pPr>
+      <w:r>
+        <w:rPr>
+          <w:rFonts w:ascii="Bahnschrift" w:hAnsi="Bahnschrift" w:cs="Arial"/>
+          <w:sz w:val="24"/>
+          <w:szCs w:val="24"/>
+          <w:lang w:bidi="ar-EG"/>
+        </w:rPr>
+        <w:t>Assistant instructors support instructors in grading assessments, monitoring live sessions, and managing student interactions.</w:t>
+      </w:r>
+    </w:p>
+    <w:p>
+      <w:pPr>
+        <w:rPr>
+          <w:rFonts w:ascii="Bahnschrift" w:hAnsi="Bahnschrift" w:cs="Arial"/>
+          <w:sz w:val="24"/>
+          <w:szCs w:val="24"/>
+          <w:lang w:bidi="ar-EG"/>
+        </w:rPr>
+      </w:pPr>
+      <w:r>
+        <w:rPr>
+          <w:rFonts w:ascii="Bahnschrift" w:hAnsi="Bahnschrift" w:cs="Arial"/>
+          <w:sz w:val="24"/>
+          <w:szCs w:val="24"/>
+          <w:lang w:bidi="ar-EG"/>
+        </w:rPr>
+        <w:t>Administrator:</w:t>
+      </w:r>
+    </w:p>
+    <w:p>
+      <w:pPr>
+        <w:rPr>
+          <w:rFonts w:ascii="Bahnschrift" w:hAnsi="Bahnschrift" w:cs="Arial"/>
+          <w:sz w:val="24"/>
+          <w:szCs w:val="24"/>
+          <w:lang w:bidi="ar-EG"/>
+        </w:rPr>
+      </w:pPr>
+      <w:r>
+        <w:rPr>
+          <w:rFonts w:ascii="Bahnschrift" w:hAnsi="Bahnschrift" w:cs="Arial"/>
+          <w:sz w:val="24"/>
+          <w:szCs w:val="24"/>
+          <w:lang w:bidi="ar-EG"/>
+        </w:rPr>
+        <w:t>Administrators manage users, courses, payments, system settings, and platform-wide reports.</w:t>
+      </w:r>
+    </w:p>
+    <w:p>
+      <w:pPr>
         <w:rPr>
           <w:rFonts w:ascii="Bahnschrift" w:hAnsi="Bahnschrift" w:cs="Arial"/>
           <w:b/>
@@ -4245,339 +4741,7 @@
           <w:szCs w:val="28"/>
           <w:lang w:bidi="ar-EG"/>
         </w:rPr>
-        <w:t>2.3 User Classes and Characteristics</w:t>
-      </w:r>
-    </w:p>
-    <w:p>
-      <w:pPr>
-        <w:rPr>
-          <w:rFonts w:ascii="Bahnschrift" w:hAnsi="Bahnschrift" w:cs="Arial"/>
-          <w:b/>
-          <w:bCs/>
-          <w:sz w:val="24"/>
-          <w:szCs w:val="24"/>
-          <w:lang w:bidi="ar-EG"/>
-        </w:rPr>
-      </w:pPr>
-      <w:r>
-        <w:rPr>
-          <w:rFonts w:ascii="Bahnschrift" w:hAnsi="Bahnschrift" w:cs="Arial"/>
-          <w:b/>
-          <w:bCs/>
-          <w:sz w:val="24"/>
-          <w:szCs w:val="24"/>
-          <w:lang w:bidi="ar-EG"/>
-        </w:rPr>
-        <w:t>2.3.1 User Classes</w:t>
-      </w:r>
-    </w:p>
-    <w:p>
-      <w:pPr>
-        <w:rPr>
-          <w:rFonts w:ascii="Bahnschrift" w:hAnsi="Bahnschrift" w:cs="Arial"/>
-          <w:sz w:val="24"/>
-          <w:szCs w:val="24"/>
-          <w:lang w:bidi="ar-EG"/>
-        </w:rPr>
-      </w:pPr>
-      <w:r>
-        <w:rPr>
-          <w:rFonts w:ascii="Bahnschrift" w:hAnsi="Bahnschrift" w:cs="Arial"/>
-          <w:sz w:val="24"/>
-          <w:szCs w:val="24"/>
-          <w:lang w:bidi="ar-EG"/>
-        </w:rPr>
-        <w:t xml:space="preserve">The </w:t>
-      </w:r>
-      <w:proofErr w:type="spellStart"/>
-      <w:r>
-        <w:rPr>
-          <w:rFonts w:ascii="Bahnschrift" w:hAnsi="Bahnschrift" w:cs="Arial"/>
-          <w:sz w:val="24"/>
-          <w:szCs w:val="24"/>
-          <w:lang w:bidi="ar-EG"/>
-        </w:rPr>
-        <w:t>Athary</w:t>
-      </w:r>
-      <w:proofErr w:type="spellEnd"/>
-      <w:r>
-        <w:rPr>
-          <w:rFonts w:ascii="Bahnschrift" w:hAnsi="Bahnschrift" w:cs="Arial"/>
-          <w:sz w:val="24"/>
-          <w:szCs w:val="24"/>
-          <w:lang w:bidi="ar-EG"/>
-        </w:rPr>
-        <w:t xml:space="preserve"> system supports the following user classes:</w:t>
-      </w:r>
-    </w:p>
-    <w:p>
-      <w:pPr>
-        <w:rPr>
-          <w:rFonts w:ascii="Bahnschrift" w:hAnsi="Bahnschrift" w:cs="Arial"/>
-          <w:sz w:val="24"/>
-          <w:szCs w:val="24"/>
-          <w:lang w:bidi="ar-EG"/>
-        </w:rPr>
-      </w:pPr>
-      <w:r>
-        <w:rPr>
-          <w:rFonts w:ascii="Bahnschrift" w:hAnsi="Bahnschrift" w:cs="Arial"/>
-          <w:sz w:val="24"/>
-          <w:szCs w:val="24"/>
-          <w:lang w:bidi="ar-EG"/>
-        </w:rPr>
-        <w:t>• Student</w:t>
-      </w:r>
-    </w:p>
-    <w:p>
-      <w:pPr>
-        <w:rPr>
-          <w:rFonts w:ascii="Bahnschrift" w:hAnsi="Bahnschrift" w:cs="Arial"/>
-          <w:sz w:val="24"/>
-          <w:szCs w:val="24"/>
-          <w:lang w:bidi="ar-EG"/>
-        </w:rPr>
-      </w:pPr>
-      <w:r>
-        <w:rPr>
-          <w:rFonts w:ascii="Bahnschrift" w:hAnsi="Bahnschrift" w:cs="Arial"/>
-          <w:sz w:val="24"/>
-          <w:szCs w:val="24"/>
-          <w:lang w:bidi="ar-EG"/>
-        </w:rPr>
-        <w:t>• Instructor</w:t>
-      </w:r>
-    </w:p>
-    <w:p>
-      <w:pPr>
-        <w:rPr>
-          <w:rFonts w:ascii="Bahnschrift" w:hAnsi="Bahnschrift" w:cs="Arial"/>
-          <w:sz w:val="24"/>
-          <w:szCs w:val="24"/>
-          <w:lang w:bidi="ar-EG"/>
-        </w:rPr>
-      </w:pPr>
-      <w:r>
-        <w:rPr>
-          <w:rFonts w:ascii="Bahnschrift" w:hAnsi="Bahnschrift" w:cs="Arial"/>
-          <w:sz w:val="24"/>
-          <w:szCs w:val="24"/>
-          <w:lang w:bidi="ar-EG"/>
-        </w:rPr>
-        <w:t>• Assistant Instructor</w:t>
-      </w:r>
-    </w:p>
-    <w:p>
-      <w:pPr>
-        <w:rPr>
-          <w:rFonts w:ascii="Bahnschrift" w:hAnsi="Bahnschrift" w:cs="Arial"/>
-          <w:sz w:val="24"/>
-          <w:szCs w:val="24"/>
-          <w:lang w:bidi="ar-EG"/>
-        </w:rPr>
-      </w:pPr>
-      <w:r>
-        <w:rPr>
-          <w:rFonts w:ascii="Bahnschrift" w:hAnsi="Bahnschrift" w:cs="Arial"/>
-          <w:sz w:val="24"/>
-          <w:szCs w:val="24"/>
-          <w:lang w:bidi="ar-EG"/>
-        </w:rPr>
-        <w:t>• Administrator</w:t>
-      </w:r>
-    </w:p>
-    <w:p>
-      <w:pPr>
-        <w:rPr>
-          <w:rFonts w:ascii="Bahnschrift" w:hAnsi="Bahnschrift" w:cs="Arial"/>
-          <w:b/>
-          <w:bCs/>
-          <w:sz w:val="24"/>
-          <w:szCs w:val="24"/>
-          <w:lang w:bidi="ar-EG"/>
-        </w:rPr>
-      </w:pPr>
-      <w:r>
-        <w:rPr>
-          <w:rFonts w:ascii="Bahnschrift" w:hAnsi="Bahnschrift" w:cs="Arial"/>
-          <w:b/>
-          <w:bCs/>
-          <w:sz w:val="24"/>
-          <w:szCs w:val="24"/>
-          <w:lang w:bidi="ar-EG"/>
-        </w:rPr>
-        <w:t>2.3.2 Characteristics of User Classes</w:t>
-      </w:r>
-    </w:p>
-    <w:p>
-      <w:pPr>
-        <w:rPr>
-          <w:rFonts w:ascii="Bahnschrift" w:hAnsi="Bahnschrift" w:cs="Arial"/>
-          <w:sz w:val="24"/>
-          <w:szCs w:val="24"/>
-          <w:lang w:bidi="ar-EG"/>
-        </w:rPr>
-      </w:pPr>
-      <w:r>
-        <w:rPr>
-          <w:rFonts w:ascii="Bahnschrift" w:hAnsi="Bahnschrift" w:cs="Arial"/>
-          <w:sz w:val="24"/>
-          <w:szCs w:val="24"/>
-          <w:lang w:bidi="ar-EG"/>
-        </w:rPr>
-        <w:t>Student:</w:t>
-      </w:r>
-    </w:p>
-    <w:p>
-      <w:pPr>
-        <w:rPr>
-          <w:rFonts w:ascii="Bahnschrift" w:hAnsi="Bahnschrift" w:cs="Arial"/>
-          <w:sz w:val="24"/>
-          <w:szCs w:val="24"/>
-          <w:lang w:bidi="ar-EG"/>
-        </w:rPr>
-      </w:pPr>
-      <w:r>
-        <w:rPr>
-          <w:rFonts w:ascii="Bahnschrift" w:hAnsi="Bahnschrift" w:cs="Arial"/>
-          <w:sz w:val="24"/>
-          <w:szCs w:val="24"/>
-          <w:lang w:bidi="ar-EG"/>
-        </w:rPr>
-        <w:t>Students use the platform to enroll in courses, view educational content, attend live sessions, take quizzes, and obtain certificates.</w:t>
-      </w:r>
-    </w:p>
-    <w:p>
-      <w:pPr>
-        <w:rPr>
-          <w:rFonts w:ascii="Bahnschrift" w:hAnsi="Bahnschrift" w:cs="Arial"/>
-          <w:sz w:val="24"/>
-          <w:szCs w:val="24"/>
-          <w:lang w:bidi="ar-EG"/>
-        </w:rPr>
-      </w:pPr>
-      <w:r>
-        <w:rPr>
-          <w:rFonts w:ascii="Bahnschrift" w:hAnsi="Bahnschrift" w:cs="Arial"/>
-          <w:sz w:val="24"/>
-          <w:szCs w:val="24"/>
-          <w:lang w:bidi="ar-EG"/>
-        </w:rPr>
-        <w:t>Instructor:</w:t>
-      </w:r>
-    </w:p>
-    <w:p>
-      <w:pPr>
-        <w:rPr>
-          <w:rFonts w:ascii="Bahnschrift" w:hAnsi="Bahnschrift" w:cs="Arial"/>
-          <w:sz w:val="24"/>
-          <w:szCs w:val="24"/>
-          <w:lang w:bidi="ar-EG"/>
-        </w:rPr>
-      </w:pPr>
-      <w:r>
-        <w:rPr>
-          <w:rFonts w:ascii="Bahnschrift" w:hAnsi="Bahnschrift" w:cs="Arial"/>
-          <w:sz w:val="24"/>
-          <w:szCs w:val="24"/>
-          <w:lang w:bidi="ar-EG"/>
-        </w:rPr>
-        <w:t>Instructors create and manage courses, upload content, conduct live sessions, create assessments</w:t>
-      </w:r>
-      <w:r>
-        <w:rPr>
-          <w:rFonts w:ascii="Bahnschrift" w:hAnsi="Bahnschrift" w:cs="Arial"/>
-          <w:sz w:val="24"/>
-          <w:szCs w:val="24"/>
-          <w:lang w:bidi="ar-EG"/>
-        </w:rPr>
-        <w:t xml:space="preserve"> and quizzes</w:t>
-      </w:r>
-      <w:r>
-        <w:rPr>
-          <w:rFonts w:ascii="Bahnschrift" w:hAnsi="Bahnschrift" w:cs="Arial"/>
-          <w:sz w:val="24"/>
-          <w:szCs w:val="24"/>
-          <w:lang w:bidi="ar-EG"/>
-        </w:rPr>
-        <w:t>, and analyze student performance.</w:t>
-      </w:r>
-    </w:p>
-    <w:p>
-      <w:pPr>
-        <w:rPr>
-          <w:rFonts w:ascii="Bahnschrift" w:hAnsi="Bahnschrift" w:cs="Arial"/>
-          <w:sz w:val="24"/>
-          <w:szCs w:val="24"/>
-          <w:lang w:bidi="ar-EG"/>
-        </w:rPr>
-      </w:pPr>
-      <w:r>
-        <w:rPr>
-          <w:rFonts w:ascii="Bahnschrift" w:hAnsi="Bahnschrift" w:cs="Arial"/>
-          <w:sz w:val="24"/>
-          <w:szCs w:val="24"/>
-          <w:lang w:bidi="ar-EG"/>
-        </w:rPr>
-        <w:t>Assistant Instructor:</w:t>
-      </w:r>
-    </w:p>
-    <w:p>
-      <w:pPr>
-        <w:rPr>
-          <w:rFonts w:ascii="Bahnschrift" w:hAnsi="Bahnschrift" w:cs="Arial"/>
-          <w:sz w:val="24"/>
-          <w:szCs w:val="24"/>
-          <w:lang w:bidi="ar-EG"/>
-        </w:rPr>
-      </w:pPr>
-      <w:r>
-        <w:rPr>
-          <w:rFonts w:ascii="Bahnschrift" w:hAnsi="Bahnschrift" w:cs="Arial"/>
-          <w:sz w:val="24"/>
-          <w:szCs w:val="24"/>
-          <w:lang w:bidi="ar-EG"/>
-        </w:rPr>
-        <w:t>Assistant instructors support instructors in grading assessments, monitoring live sessions, and managing student interactions.</w:t>
-      </w:r>
-    </w:p>
-    <w:p>
-      <w:pPr>
-        <w:rPr>
-          <w:rFonts w:ascii="Bahnschrift" w:hAnsi="Bahnschrift" w:cs="Arial"/>
-          <w:sz w:val="24"/>
-          <w:szCs w:val="24"/>
-          <w:lang w:bidi="ar-EG"/>
-        </w:rPr>
-      </w:pPr>
-      <w:r>
-        <w:rPr>
-          <w:rFonts w:ascii="Bahnschrift" w:hAnsi="Bahnschrift" w:cs="Arial"/>
-          <w:sz w:val="24"/>
-          <w:szCs w:val="24"/>
-          <w:lang w:bidi="ar-EG"/>
-        </w:rPr>
-        <w:t>Administrator:</w:t>
-      </w:r>
-    </w:p>
-    <w:p>
-      <w:pPr>
-        <w:rPr>
-          <w:rFonts w:ascii="Bahnschrift" w:hAnsi="Bahnschrift" w:cs="Arial"/>
-          <w:sz w:val="24"/>
-          <w:szCs w:val="24"/>
-          <w:lang w:bidi="ar-EG"/>
-        </w:rPr>
-      </w:pPr>
-      <w:r>
-        <w:rPr>
-          <w:rFonts w:ascii="Bahnschrift" w:hAnsi="Bahnschrift" w:cs="Arial"/>
-          <w:sz w:val="24"/>
-          <w:szCs w:val="24"/>
-          <w:lang w:bidi="ar-EG"/>
-        </w:rPr>
-        <w:t>Administrators manage users, courses, payments, system settings, and platform-wide reports.</w:t>
-      </w:r>
+      </w:pPr>
     </w:p>
     <w:p>
       <w:pPr>
@@ -4602,9 +4766,7 @@
           <w:lang w:bidi="ar-EG"/>
         </w:rPr>
       </w:pPr>
-    </w:p>
-    <w:p>
-      <w:pPr>
+      <w:r>
         <w:rPr>
           <w:rFonts w:ascii="Bahnschrift" w:hAnsi="Bahnschrift" w:cs="Arial"/>
           <w:b/>
@@ -4613,6 +4775,237 @@
           <w:szCs w:val="28"/>
           <w:lang w:bidi="ar-EG"/>
         </w:rPr>
+        <w:lastRenderedPageBreak/>
+        <w:t>2.4 Operating Environment</w:t>
+      </w:r>
+    </w:p>
+    <w:p>
+      <w:pPr>
+        <w:rPr>
+          <w:rFonts w:ascii="Bahnschrift" w:hAnsi="Bahnschrift" w:cs="Arial"/>
+          <w:sz w:val="24"/>
+          <w:szCs w:val="24"/>
+          <w:lang w:bidi="ar-EG"/>
+        </w:rPr>
+      </w:pPr>
+      <w:r>
+        <w:rPr>
+          <w:rFonts w:ascii="Bahnschrift" w:hAnsi="Bahnschrift" w:cs="Arial"/>
+          <w:sz w:val="24"/>
+          <w:szCs w:val="24"/>
+          <w:lang w:bidi="ar-EG"/>
+        </w:rPr>
+        <w:t xml:space="preserve">The </w:t>
+      </w:r>
+      <w:proofErr w:type="spellStart"/>
+      <w:r>
+        <w:rPr>
+          <w:rFonts w:ascii="Bahnschrift" w:hAnsi="Bahnschrift" w:cs="Arial"/>
+          <w:sz w:val="24"/>
+          <w:szCs w:val="24"/>
+          <w:lang w:bidi="ar-EG"/>
+        </w:rPr>
+        <w:t>Athary</w:t>
+      </w:r>
+      <w:proofErr w:type="spellEnd"/>
+      <w:r>
+        <w:rPr>
+          <w:rFonts w:ascii="Bahnschrift" w:hAnsi="Bahnschrift" w:cs="Arial"/>
+          <w:sz w:val="24"/>
+          <w:szCs w:val="24"/>
+          <w:lang w:bidi="ar-EG"/>
+        </w:rPr>
+        <w:t xml:space="preserve"> platform operates as a web-based application accessible through modern web browsers.</w:t>
+      </w:r>
+    </w:p>
+    <w:p>
+      <w:pPr>
+        <w:rPr>
+          <w:rFonts w:ascii="Bahnschrift" w:hAnsi="Bahnschrift" w:cs="Arial"/>
+          <w:b/>
+          <w:bCs/>
+          <w:sz w:val="24"/>
+          <w:szCs w:val="24"/>
+          <w:lang w:bidi="ar-EG"/>
+        </w:rPr>
+      </w:pPr>
+      <w:r>
+        <w:rPr>
+          <w:rFonts w:ascii="Bahnschrift" w:hAnsi="Bahnschrift" w:cs="Arial"/>
+          <w:b/>
+          <w:bCs/>
+          <w:sz w:val="24"/>
+          <w:szCs w:val="24"/>
+          <w:lang w:bidi="ar-EG"/>
+        </w:rPr>
+        <w:t>Client Side:</w:t>
+      </w:r>
+    </w:p>
+    <w:p>
+      <w:pPr>
+        <w:rPr>
+          <w:rFonts w:ascii="Bahnschrift" w:hAnsi="Bahnschrift" w:cs="Arial"/>
+          <w:sz w:val="24"/>
+          <w:szCs w:val="24"/>
+          <w:lang w:bidi="ar-EG"/>
+        </w:rPr>
+      </w:pPr>
+      <w:r>
+        <w:rPr>
+          <w:rFonts w:ascii="Bahnschrift" w:hAnsi="Bahnschrift" w:cs="Arial"/>
+          <w:sz w:val="24"/>
+          <w:szCs w:val="24"/>
+          <w:lang w:bidi="ar-EG"/>
+        </w:rPr>
+        <w:t xml:space="preserve">• Web browser (Google Chrome, Firefox, </w:t>
+      </w:r>
+      <w:proofErr w:type="gramStart"/>
+      <w:r>
+        <w:rPr>
+          <w:rFonts w:ascii="Bahnschrift" w:hAnsi="Bahnschrift" w:cs="Arial"/>
+          <w:sz w:val="24"/>
+          <w:szCs w:val="24"/>
+          <w:lang w:bidi="ar-EG"/>
+        </w:rPr>
+        <w:t>Edge</w:t>
+      </w:r>
+      <w:proofErr w:type="gramEnd"/>
+      <w:r>
+        <w:rPr>
+          <w:rFonts w:ascii="Bahnschrift" w:hAnsi="Bahnschrift" w:cs="Arial"/>
+          <w:sz w:val="24"/>
+          <w:szCs w:val="24"/>
+          <w:lang w:bidi="ar-EG"/>
+        </w:rPr>
+        <w:t>)</w:t>
+      </w:r>
+    </w:p>
+    <w:p>
+      <w:pPr>
+        <w:rPr>
+          <w:rFonts w:ascii="Bahnschrift" w:hAnsi="Bahnschrift" w:cs="Arial"/>
+          <w:sz w:val="24"/>
+          <w:szCs w:val="24"/>
+          <w:lang w:bidi="ar-EG"/>
+        </w:rPr>
+      </w:pPr>
+      <w:r>
+        <w:rPr>
+          <w:rFonts w:ascii="Bahnschrift" w:hAnsi="Bahnschrift" w:cs="Arial"/>
+          <w:sz w:val="24"/>
+          <w:szCs w:val="24"/>
+          <w:lang w:bidi="ar-EG"/>
+        </w:rPr>
+        <w:t>• Desktop, tablet, or mobile device</w:t>
+      </w:r>
+    </w:p>
+    <w:p>
+      <w:pPr>
+        <w:rPr>
+          <w:rFonts w:ascii="Bahnschrift" w:hAnsi="Bahnschrift" w:cs="Arial"/>
+          <w:b/>
+          <w:bCs/>
+          <w:sz w:val="24"/>
+          <w:szCs w:val="24"/>
+          <w:lang w:bidi="ar-EG"/>
+        </w:rPr>
+      </w:pPr>
+      <w:r>
+        <w:rPr>
+          <w:rFonts w:ascii="Bahnschrift" w:hAnsi="Bahnschrift" w:cs="Arial"/>
+          <w:b/>
+          <w:bCs/>
+          <w:sz w:val="24"/>
+          <w:szCs w:val="24"/>
+          <w:lang w:bidi="ar-EG"/>
+        </w:rPr>
+        <w:t>Server Side:</w:t>
+      </w:r>
+    </w:p>
+    <w:p>
+      <w:pPr>
+        <w:rPr>
+          <w:rFonts w:ascii="Bahnschrift" w:hAnsi="Bahnschrift" w:cs="Arial"/>
+          <w:sz w:val="24"/>
+          <w:szCs w:val="24"/>
+          <w:lang w:bidi="ar-EG"/>
+        </w:rPr>
+      </w:pPr>
+      <w:r>
+        <w:rPr>
+          <w:rFonts w:ascii="Bahnschrift" w:hAnsi="Bahnschrift" w:cs="Arial"/>
+          <w:sz w:val="24"/>
+          <w:szCs w:val="24"/>
+          <w:lang w:bidi="ar-EG"/>
+        </w:rPr>
+        <w:t>• Web server hosting backend services</w:t>
+      </w:r>
+    </w:p>
+    <w:p>
+      <w:pPr>
+        <w:rPr>
+          <w:rFonts w:ascii="Bahnschrift" w:hAnsi="Bahnschrift" w:cs="Arial"/>
+          <w:sz w:val="24"/>
+          <w:szCs w:val="24"/>
+          <w:lang w:bidi="ar-EG"/>
+        </w:rPr>
+      </w:pPr>
+      <w:r>
+        <w:rPr>
+          <w:rFonts w:ascii="Bahnschrift" w:hAnsi="Bahnschrift" w:cs="Arial"/>
+          <w:sz w:val="24"/>
+          <w:szCs w:val="24"/>
+          <w:lang w:bidi="ar-EG"/>
+        </w:rPr>
+        <w:t>• Relational Database Management System</w:t>
+      </w:r>
+    </w:p>
+    <w:p>
+      <w:pPr>
+        <w:rPr>
+          <w:rFonts w:ascii="Bahnschrift" w:hAnsi="Bahnschrift" w:cs="Arial"/>
+          <w:sz w:val="24"/>
+          <w:szCs w:val="24"/>
+          <w:lang w:bidi="ar-EG"/>
+        </w:rPr>
+      </w:pPr>
+      <w:r>
+        <w:rPr>
+          <w:rFonts w:ascii="Bahnschrift" w:hAnsi="Bahnschrift" w:cs="Arial"/>
+          <w:sz w:val="24"/>
+          <w:szCs w:val="24"/>
+          <w:lang w:bidi="ar-EG"/>
+        </w:rPr>
+        <w:t>• Cloud storage for media content</w:t>
+      </w:r>
+    </w:p>
+    <w:p>
+      <w:pPr>
+        <w:rPr>
+          <w:rFonts w:ascii="Bahnschrift" w:hAnsi="Bahnschrift" w:cs="Arial"/>
+          <w:sz w:val="24"/>
+          <w:szCs w:val="24"/>
+          <w:lang w:bidi="ar-EG"/>
+        </w:rPr>
+      </w:pPr>
+      <w:r>
+        <w:rPr>
+          <w:rFonts w:ascii="Bahnschrift" w:hAnsi="Bahnschrift" w:cs="Arial"/>
+          <w:sz w:val="24"/>
+          <w:szCs w:val="24"/>
+          <w:lang w:bidi="ar-EG"/>
+        </w:rPr>
+        <w:t>• Internet connection required for all operations</w:t>
+      </w:r>
+    </w:p>
+    <w:p>
+      <w:pPr>
+        <w:rPr>
+          <w:rFonts w:ascii="Bahnschrift" w:hAnsi="Bahnschrift" w:cs="Arial"/>
+          <w:sz w:val="24"/>
+          <w:szCs w:val="24"/>
+          <w:lang w:bidi="ar-EG"/>
+        </w:rPr>
       </w:pPr>
       <w:r>
         <w:rPr>
@@ -4623,211 +5016,172 @@
           <w:szCs w:val="28"/>
           <w:lang w:bidi="ar-EG"/>
         </w:rPr>
-        <w:lastRenderedPageBreak/>
-        <w:t>2.4 Operating Environment</w:t>
-      </w:r>
-    </w:p>
-    <w:p>
-      <w:pPr>
-        <w:rPr>
-          <w:rFonts w:ascii="Bahnschrift" w:hAnsi="Bahnschrift" w:cs="Arial"/>
-          <w:sz w:val="24"/>
-          <w:szCs w:val="24"/>
-          <w:lang w:bidi="ar-EG"/>
-        </w:rPr>
-      </w:pPr>
-      <w:r>
-        <w:rPr>
-          <w:rFonts w:ascii="Bahnschrift" w:hAnsi="Bahnschrift" w:cs="Arial"/>
-          <w:sz w:val="24"/>
-          <w:szCs w:val="24"/>
-          <w:lang w:bidi="ar-EG"/>
-        </w:rPr>
-        <w:t xml:space="preserve">The </w:t>
-      </w:r>
-      <w:proofErr w:type="spellStart"/>
-      <w:r>
-        <w:rPr>
-          <w:rFonts w:ascii="Bahnschrift" w:hAnsi="Bahnschrift" w:cs="Arial"/>
-          <w:sz w:val="24"/>
-          <w:szCs w:val="24"/>
-          <w:lang w:bidi="ar-EG"/>
-        </w:rPr>
-        <w:t>Athary</w:t>
-      </w:r>
-      <w:proofErr w:type="spellEnd"/>
-      <w:r>
-        <w:rPr>
-          <w:rFonts w:ascii="Bahnschrift" w:hAnsi="Bahnschrift" w:cs="Arial"/>
-          <w:sz w:val="24"/>
-          <w:szCs w:val="24"/>
-          <w:lang w:bidi="ar-EG"/>
-        </w:rPr>
-        <w:t xml:space="preserve"> platform operates as a web-based application accessible through modern web browsers.</w:t>
-      </w:r>
-    </w:p>
-    <w:p>
-      <w:pPr>
-        <w:rPr>
-          <w:rFonts w:ascii="Bahnschrift" w:hAnsi="Bahnschrift" w:cs="Arial"/>
-          <w:b/>
-          <w:bCs/>
-          <w:sz w:val="24"/>
-          <w:szCs w:val="24"/>
-          <w:lang w:bidi="ar-EG"/>
-        </w:rPr>
-      </w:pPr>
-      <w:r>
-        <w:rPr>
-          <w:rFonts w:ascii="Bahnschrift" w:hAnsi="Bahnschrift" w:cs="Arial"/>
-          <w:b/>
-          <w:bCs/>
-          <w:sz w:val="24"/>
-          <w:szCs w:val="24"/>
-          <w:lang w:bidi="ar-EG"/>
-        </w:rPr>
-        <w:t>Client Side:</w:t>
-      </w:r>
-    </w:p>
-    <w:p>
-      <w:pPr>
-        <w:rPr>
-          <w:rFonts w:ascii="Bahnschrift" w:hAnsi="Bahnschrift" w:cs="Arial"/>
-          <w:sz w:val="24"/>
-          <w:szCs w:val="24"/>
-          <w:lang w:bidi="ar-EG"/>
-        </w:rPr>
-      </w:pPr>
-      <w:r>
-        <w:rPr>
-          <w:rFonts w:ascii="Bahnschrift" w:hAnsi="Bahnschrift" w:cs="Arial"/>
-          <w:sz w:val="24"/>
-          <w:szCs w:val="24"/>
-          <w:lang w:bidi="ar-EG"/>
-        </w:rPr>
-        <w:t>• Web browser (Google Chrome, Firefox, Edge)</w:t>
-      </w:r>
-    </w:p>
-    <w:p>
-      <w:pPr>
-        <w:rPr>
-          <w:rFonts w:ascii="Bahnschrift" w:hAnsi="Bahnschrift" w:cs="Arial"/>
-          <w:sz w:val="24"/>
-          <w:szCs w:val="24"/>
-          <w:lang w:bidi="ar-EG"/>
-        </w:rPr>
-      </w:pPr>
-      <w:r>
-        <w:rPr>
-          <w:rFonts w:ascii="Bahnschrift" w:hAnsi="Bahnschrift" w:cs="Arial"/>
-          <w:sz w:val="24"/>
-          <w:szCs w:val="24"/>
-          <w:lang w:bidi="ar-EG"/>
-        </w:rPr>
-        <w:t>• Desktop, tablet, or mobile device</w:t>
-      </w:r>
-    </w:p>
-    <w:p>
-      <w:pPr>
-        <w:rPr>
-          <w:rFonts w:ascii="Bahnschrift" w:hAnsi="Bahnschrift" w:cs="Arial"/>
-          <w:b/>
-          <w:bCs/>
-          <w:sz w:val="24"/>
-          <w:szCs w:val="24"/>
-          <w:lang w:bidi="ar-EG"/>
-        </w:rPr>
-      </w:pPr>
-      <w:r>
-        <w:rPr>
-          <w:rFonts w:ascii="Bahnschrift" w:hAnsi="Bahnschrift" w:cs="Arial"/>
-          <w:b/>
-          <w:bCs/>
-          <w:sz w:val="24"/>
-          <w:szCs w:val="24"/>
-          <w:lang w:bidi="ar-EG"/>
-        </w:rPr>
-        <w:t>Server Side:</w:t>
-      </w:r>
-    </w:p>
-    <w:p>
-      <w:pPr>
-        <w:rPr>
-          <w:rFonts w:ascii="Bahnschrift" w:hAnsi="Bahnschrift" w:cs="Arial"/>
-          <w:sz w:val="24"/>
-          <w:szCs w:val="24"/>
-          <w:lang w:bidi="ar-EG"/>
-        </w:rPr>
-      </w:pPr>
-      <w:r>
-        <w:rPr>
-          <w:rFonts w:ascii="Bahnschrift" w:hAnsi="Bahnschrift" w:cs="Arial"/>
-          <w:sz w:val="24"/>
-          <w:szCs w:val="24"/>
-          <w:lang w:bidi="ar-EG"/>
-        </w:rPr>
-        <w:t>• Web server hosting backend services</w:t>
-      </w:r>
-    </w:p>
-    <w:p>
-      <w:pPr>
-        <w:rPr>
-          <w:rFonts w:ascii="Bahnschrift" w:hAnsi="Bahnschrift" w:cs="Arial"/>
-          <w:sz w:val="24"/>
-          <w:szCs w:val="24"/>
-          <w:lang w:bidi="ar-EG"/>
-        </w:rPr>
-      </w:pPr>
-      <w:r>
-        <w:rPr>
-          <w:rFonts w:ascii="Bahnschrift" w:hAnsi="Bahnschrift" w:cs="Arial"/>
-          <w:sz w:val="24"/>
-          <w:szCs w:val="24"/>
-          <w:lang w:bidi="ar-EG"/>
-        </w:rPr>
-        <w:t>• Relational Database Management System</w:t>
-      </w:r>
-    </w:p>
-    <w:p>
-      <w:pPr>
-        <w:rPr>
-          <w:rFonts w:ascii="Bahnschrift" w:hAnsi="Bahnschrift" w:cs="Arial"/>
-          <w:sz w:val="24"/>
-          <w:szCs w:val="24"/>
-          <w:lang w:bidi="ar-EG"/>
-        </w:rPr>
-      </w:pPr>
-      <w:r>
-        <w:rPr>
-          <w:rFonts w:ascii="Bahnschrift" w:hAnsi="Bahnschrift" w:cs="Arial"/>
-          <w:sz w:val="24"/>
-          <w:szCs w:val="24"/>
-          <w:lang w:bidi="ar-EG"/>
-        </w:rPr>
-        <w:t>• Cloud storage for media content</w:t>
-      </w:r>
-    </w:p>
-    <w:p>
-      <w:pPr>
-        <w:rPr>
-          <w:rFonts w:ascii="Bahnschrift" w:hAnsi="Bahnschrift" w:cs="Arial"/>
-          <w:sz w:val="24"/>
-          <w:szCs w:val="24"/>
-          <w:lang w:bidi="ar-EG"/>
-        </w:rPr>
-      </w:pPr>
-      <w:r>
-        <w:rPr>
-          <w:rFonts w:ascii="Bahnschrift" w:hAnsi="Bahnschrift" w:cs="Arial"/>
-          <w:sz w:val="24"/>
-          <w:szCs w:val="24"/>
-          <w:lang w:bidi="ar-EG"/>
-        </w:rPr>
-        <w:t>• Internet connection required for all operations</w:t>
-      </w:r>
-    </w:p>
-    <w:p>
-      <w:pPr>
+        <w:t>2.5 Design and Implementation Constraints</w:t>
+      </w:r>
+    </w:p>
+    <w:p>
+      <w:pPr>
+        <w:rPr>
+          <w:rFonts w:ascii="Bahnschrift" w:hAnsi="Bahnschrift" w:cs="Arial"/>
+          <w:sz w:val="24"/>
+          <w:szCs w:val="24"/>
+          <w:lang w:bidi="ar-EG"/>
+        </w:rPr>
+      </w:pPr>
+      <w:r>
+        <w:rPr>
+          <w:rFonts w:ascii="Bahnschrift" w:hAnsi="Bahnschrift" w:cs="Arial"/>
+          <w:sz w:val="24"/>
+          <w:szCs w:val="24"/>
+          <w:lang w:bidi="ar-EG"/>
+        </w:rPr>
+        <w:t>• The system shall be developed as a web-based platform.</w:t>
+      </w:r>
+    </w:p>
+    <w:p>
+      <w:pPr>
+        <w:rPr>
+          <w:rFonts w:ascii="Bahnschrift" w:hAnsi="Bahnschrift" w:cs="Arial"/>
+          <w:sz w:val="24"/>
+          <w:szCs w:val="24"/>
+          <w:lang w:bidi="ar-EG"/>
+        </w:rPr>
+      </w:pPr>
+      <w:r>
+        <w:rPr>
+          <w:rFonts w:ascii="Bahnschrift" w:hAnsi="Bahnschrift" w:cs="Arial"/>
+          <w:sz w:val="24"/>
+          <w:szCs w:val="24"/>
+          <w:lang w:bidi="ar-EG"/>
+        </w:rPr>
+        <w:t>• The backend shall use a RESTful API architecture.</w:t>
+      </w:r>
+    </w:p>
+    <w:p>
+      <w:pPr>
+        <w:rPr>
+          <w:rFonts w:ascii="Bahnschrift" w:hAnsi="Bahnschrift" w:cs="Arial"/>
+          <w:sz w:val="24"/>
+          <w:szCs w:val="24"/>
+          <w:lang w:bidi="ar-EG"/>
+        </w:rPr>
+      </w:pPr>
+      <w:r>
+        <w:rPr>
+          <w:rFonts w:ascii="Bahnschrift" w:hAnsi="Bahnschrift" w:cs="Arial"/>
+          <w:sz w:val="24"/>
+          <w:szCs w:val="24"/>
+          <w:lang w:bidi="ar-EG"/>
+        </w:rPr>
+        <w:t>• The frontend shall be developed using modern JavaScript frameworks.</w:t>
+      </w:r>
+    </w:p>
+    <w:p>
+      <w:pPr>
+        <w:rPr>
+          <w:rFonts w:ascii="Bahnschrift" w:hAnsi="Bahnschrift" w:cs="Arial"/>
+          <w:sz w:val="24"/>
+          <w:szCs w:val="24"/>
+          <w:lang w:bidi="ar-EG"/>
+        </w:rPr>
+      </w:pPr>
+      <w:r>
+        <w:rPr>
+          <w:rFonts w:ascii="Bahnschrift" w:hAnsi="Bahnschrift" w:cs="Arial"/>
+          <w:sz w:val="24"/>
+          <w:szCs w:val="24"/>
+          <w:lang w:bidi="ar-EG"/>
+        </w:rPr>
+        <w:t>• Payment processing must comply with security standards.</w:t>
+      </w:r>
+    </w:p>
+    <w:p>
+      <w:pPr>
+        <w:rPr>
+          <w:rFonts w:ascii="Bahnschrift" w:hAnsi="Bahnschrift" w:cs="Arial"/>
+          <w:sz w:val="24"/>
+          <w:szCs w:val="24"/>
+          <w:lang w:bidi="ar-EG"/>
+        </w:rPr>
+      </w:pPr>
+      <w:r>
+        <w:rPr>
+          <w:rFonts w:ascii="Bahnschrift" w:hAnsi="Bahnschrift" w:cs="Arial"/>
+          <w:sz w:val="24"/>
+          <w:szCs w:val="24"/>
+          <w:lang w:bidi="ar-EG"/>
+        </w:rPr>
+        <w:t>• Video content must be stored using cloud-based storage services.</w:t>
+      </w:r>
+    </w:p>
+    <w:p>
+      <w:pPr>
+        <w:rPr>
+          <w:rFonts w:ascii="Bahnschrift" w:hAnsi="Bahnschrift" w:cs="Arial"/>
+          <w:sz w:val="24"/>
+          <w:szCs w:val="24"/>
+          <w:rtl/>
+          <w:lang w:bidi="ar-EG"/>
+        </w:rPr>
+      </w:pPr>
+      <w:r>
+        <w:rPr>
+          <w:rFonts w:ascii="Bahnschrift" w:hAnsi="Bahnschrift" w:cs="Arial"/>
+          <w:sz w:val="24"/>
+          <w:szCs w:val="24"/>
+          <w:lang w:bidi="ar-EG"/>
+        </w:rPr>
+        <w:t>• The system must support role-based access control.</w:t>
+      </w:r>
+    </w:p>
+    <w:p>
+      <w:pPr>
+        <w:rPr>
+          <w:rFonts w:ascii="Bahnschrift" w:hAnsi="Bahnschrift" w:cs="Arial"/>
+          <w:sz w:val="24"/>
+          <w:szCs w:val="24"/>
+          <w:lang w:bidi="ar-EG"/>
+        </w:rPr>
+      </w:pPr>
+      <w:r>
+        <w:rPr>
+          <w:rFonts w:ascii="Bahnschrift" w:hAnsi="Bahnschrift" w:cs="Arial"/>
+          <w:sz w:val="24"/>
+          <w:szCs w:val="24"/>
+          <w:lang w:bidi="ar-EG"/>
+        </w:rPr>
+        <w:t>• The AI-based features depend on external Artificial Intelligence services for content analysis, quiz generation, and performance analytics.</w:t>
+      </w:r>
+    </w:p>
+    <w:p>
+      <w:pPr>
+        <w:rPr>
+          <w:rFonts w:ascii="Bahnschrift" w:hAnsi="Bahnschrift" w:cs="Arial"/>
+          <w:sz w:val="24"/>
+          <w:szCs w:val="24"/>
+          <w:lang w:bidi="ar-EG"/>
+        </w:rPr>
+      </w:pPr>
+      <w:r>
+        <w:rPr>
+          <w:rFonts w:ascii="Bahnschrift" w:hAnsi="Bahnschrift" w:cs="Arial"/>
+          <w:sz w:val="24"/>
+          <w:szCs w:val="24"/>
+          <w:lang w:bidi="ar-EG"/>
+        </w:rPr>
+        <w:t>• Availability and accuracy of AI-generated outputs are subject to the limitations and response quality of third-party AI service providers.</w:t>
+      </w:r>
+    </w:p>
+    <w:p>
+      <w:pPr>
+        <w:rPr>
+          <w:rFonts w:ascii="Bahnschrift" w:hAnsi="Bahnschrift" w:cs="Arial"/>
+          <w:sz w:val="24"/>
+          <w:szCs w:val="24"/>
+          <w:lang w:bidi="ar-EG"/>
+        </w:rPr>
+      </w:pPr>
+      <w:r>
         <w:rPr>
           <w:rFonts w:ascii="Bahnschrift" w:hAnsi="Bahnschrift" w:cs="Arial"/>
           <w:b/>
@@ -4836,6 +5190,132 @@
           <w:szCs w:val="28"/>
           <w:lang w:bidi="ar-EG"/>
         </w:rPr>
+        <w:t>2.6 Project Documentation</w:t>
+      </w:r>
+    </w:p>
+    <w:p>
+      <w:pPr>
+        <w:rPr>
+          <w:rFonts w:ascii="Bahnschrift" w:hAnsi="Bahnschrift" w:cs="Arial"/>
+          <w:sz w:val="24"/>
+          <w:szCs w:val="24"/>
+          <w:lang w:bidi="ar-EG"/>
+        </w:rPr>
+      </w:pPr>
+      <w:r>
+        <w:rPr>
+          <w:rFonts w:ascii="Bahnschrift" w:hAnsi="Bahnschrift" w:cs="Arial"/>
+          <w:sz w:val="24"/>
+          <w:szCs w:val="24"/>
+          <w:lang w:bidi="ar-EG"/>
+        </w:rPr>
+        <w:t xml:space="preserve">The following documents are produced as part of the </w:t>
+      </w:r>
+      <w:proofErr w:type="spellStart"/>
+      <w:r>
+        <w:rPr>
+          <w:rFonts w:ascii="Bahnschrift" w:hAnsi="Bahnschrift" w:cs="Arial"/>
+          <w:sz w:val="24"/>
+          <w:szCs w:val="24"/>
+          <w:lang w:bidi="ar-EG"/>
+        </w:rPr>
+        <w:t>Athary</w:t>
+      </w:r>
+      <w:proofErr w:type="spellEnd"/>
+      <w:r>
+        <w:rPr>
+          <w:rFonts w:ascii="Bahnschrift" w:hAnsi="Bahnschrift" w:cs="Arial"/>
+          <w:sz w:val="24"/>
+          <w:szCs w:val="24"/>
+          <w:lang w:bidi="ar-EG"/>
+        </w:rPr>
+        <w:t xml:space="preserve"> project:</w:t>
+      </w:r>
+    </w:p>
+    <w:p>
+      <w:pPr>
+        <w:rPr>
+          <w:rFonts w:ascii="Bahnschrift" w:hAnsi="Bahnschrift" w:cs="Arial"/>
+          <w:sz w:val="24"/>
+          <w:szCs w:val="24"/>
+          <w:lang w:bidi="ar-EG"/>
+        </w:rPr>
+      </w:pPr>
+      <w:r>
+        <w:rPr>
+          <w:rFonts w:ascii="Bahnschrift" w:hAnsi="Bahnschrift" w:cs="Arial"/>
+          <w:sz w:val="24"/>
+          <w:szCs w:val="24"/>
+          <w:lang w:bidi="ar-EG"/>
+        </w:rPr>
+        <w:t>• Software Requirements Specification (SRS)</w:t>
+      </w:r>
+    </w:p>
+    <w:p>
+      <w:pPr>
+        <w:rPr>
+          <w:rFonts w:ascii="Bahnschrift" w:hAnsi="Bahnschrift" w:cs="Arial"/>
+          <w:sz w:val="24"/>
+          <w:szCs w:val="24"/>
+          <w:lang w:bidi="ar-EG"/>
+        </w:rPr>
+      </w:pPr>
+      <w:r>
+        <w:rPr>
+          <w:rFonts w:ascii="Bahnschrift" w:hAnsi="Bahnschrift" w:cs="Arial"/>
+          <w:sz w:val="24"/>
+          <w:szCs w:val="24"/>
+          <w:lang w:bidi="ar-EG"/>
+        </w:rPr>
+        <w:t>• Use Case Specification Document</w:t>
+      </w:r>
+    </w:p>
+    <w:p>
+      <w:pPr>
+        <w:rPr>
+          <w:rFonts w:ascii="Bahnschrift" w:hAnsi="Bahnschrift" w:cs="Arial"/>
+          <w:sz w:val="24"/>
+          <w:szCs w:val="24"/>
+          <w:lang w:bidi="ar-EG"/>
+        </w:rPr>
+      </w:pPr>
+      <w:r>
+        <w:rPr>
+          <w:rFonts w:ascii="Bahnschrift" w:hAnsi="Bahnschrift" w:cs="Arial"/>
+          <w:sz w:val="24"/>
+          <w:szCs w:val="24"/>
+          <w:lang w:bidi="ar-EG"/>
+        </w:rPr>
+        <w:t>• Database Design Document</w:t>
+      </w:r>
+    </w:p>
+    <w:p>
+      <w:pPr>
+        <w:rPr>
+          <w:rFonts w:ascii="Bahnschrift" w:hAnsi="Bahnschrift" w:cs="Arial"/>
+          <w:sz w:val="24"/>
+          <w:szCs w:val="24"/>
+          <w:lang w:bidi="ar-EG"/>
+        </w:rPr>
+      </w:pPr>
+      <w:r>
+        <w:rPr>
+          <w:rFonts w:ascii="Bahnschrift" w:hAnsi="Bahnschrift" w:cs="Arial"/>
+          <w:sz w:val="24"/>
+          <w:szCs w:val="24"/>
+          <w:lang w:bidi="ar-EG"/>
+        </w:rPr>
+        <w:t>• System Architecture Diagram</w:t>
+      </w:r>
+    </w:p>
+    <w:p>
+      <w:pPr>
+        <w:rPr>
+          <w:rFonts w:ascii="Bahnschrift" w:hAnsi="Bahnschrift" w:cs="Arial"/>
+          <w:sz w:val="24"/>
+          <w:szCs w:val="24"/>
+          <w:lang w:bidi="ar-EG"/>
+        </w:rPr>
       </w:pPr>
       <w:r>
         <w:rPr>
@@ -4846,320 +5326,6 @@
           <w:szCs w:val="28"/>
           <w:lang w:bidi="ar-EG"/>
         </w:rPr>
-        <w:t>2.5 Design and Implementation Constraints</w:t>
-      </w:r>
-    </w:p>
-    <w:p>
-      <w:pPr>
-        <w:rPr>
-          <w:rFonts w:ascii="Bahnschrift" w:hAnsi="Bahnschrift" w:cs="Arial"/>
-          <w:sz w:val="24"/>
-          <w:szCs w:val="24"/>
-          <w:lang w:bidi="ar-EG"/>
-        </w:rPr>
-      </w:pPr>
-      <w:r>
-        <w:rPr>
-          <w:rFonts w:ascii="Bahnschrift" w:hAnsi="Bahnschrift" w:cs="Arial"/>
-          <w:sz w:val="24"/>
-          <w:szCs w:val="24"/>
-          <w:lang w:bidi="ar-EG"/>
-        </w:rPr>
-        <w:t>• The system shall be developed as a web-based platform.</w:t>
-      </w:r>
-    </w:p>
-    <w:p>
-      <w:pPr>
-        <w:rPr>
-          <w:rFonts w:ascii="Bahnschrift" w:hAnsi="Bahnschrift" w:cs="Arial"/>
-          <w:sz w:val="24"/>
-          <w:szCs w:val="24"/>
-          <w:lang w:bidi="ar-EG"/>
-        </w:rPr>
-      </w:pPr>
-      <w:r>
-        <w:rPr>
-          <w:rFonts w:ascii="Bahnschrift" w:hAnsi="Bahnschrift" w:cs="Arial"/>
-          <w:sz w:val="24"/>
-          <w:szCs w:val="24"/>
-          <w:lang w:bidi="ar-EG"/>
-        </w:rPr>
-        <w:t>• The backend shall use a RESTful API architecture.</w:t>
-      </w:r>
-    </w:p>
-    <w:p>
-      <w:pPr>
-        <w:rPr>
-          <w:rFonts w:ascii="Bahnschrift" w:hAnsi="Bahnschrift" w:cs="Arial"/>
-          <w:sz w:val="24"/>
-          <w:szCs w:val="24"/>
-          <w:lang w:bidi="ar-EG"/>
-        </w:rPr>
-      </w:pPr>
-      <w:r>
-        <w:rPr>
-          <w:rFonts w:ascii="Bahnschrift" w:hAnsi="Bahnschrift" w:cs="Arial"/>
-          <w:sz w:val="24"/>
-          <w:szCs w:val="24"/>
-          <w:lang w:bidi="ar-EG"/>
-        </w:rPr>
-        <w:t>• The frontend shall be developed using modern JavaScript frameworks.</w:t>
-      </w:r>
-    </w:p>
-    <w:p>
-      <w:pPr>
-        <w:rPr>
-          <w:rFonts w:ascii="Bahnschrift" w:hAnsi="Bahnschrift" w:cs="Arial"/>
-          <w:sz w:val="24"/>
-          <w:szCs w:val="24"/>
-          <w:lang w:bidi="ar-EG"/>
-        </w:rPr>
-      </w:pPr>
-      <w:r>
-        <w:rPr>
-          <w:rFonts w:ascii="Bahnschrift" w:hAnsi="Bahnschrift" w:cs="Arial"/>
-          <w:sz w:val="24"/>
-          <w:szCs w:val="24"/>
-          <w:lang w:bidi="ar-EG"/>
-        </w:rPr>
-        <w:t>• Payment processing must comply with security standards.</w:t>
-      </w:r>
-    </w:p>
-    <w:p>
-      <w:pPr>
-        <w:rPr>
-          <w:rFonts w:ascii="Bahnschrift" w:hAnsi="Bahnschrift" w:cs="Arial"/>
-          <w:sz w:val="24"/>
-          <w:szCs w:val="24"/>
-          <w:lang w:bidi="ar-EG"/>
-        </w:rPr>
-      </w:pPr>
-      <w:r>
-        <w:rPr>
-          <w:rFonts w:ascii="Bahnschrift" w:hAnsi="Bahnschrift" w:cs="Arial"/>
-          <w:sz w:val="24"/>
-          <w:szCs w:val="24"/>
-          <w:lang w:bidi="ar-EG"/>
-        </w:rPr>
-        <w:t>• Video content must be stored using cloud-based storage services.</w:t>
-      </w:r>
-    </w:p>
-    <w:p>
-      <w:pPr>
-        <w:rPr>
-          <w:rFonts w:ascii="Bahnschrift" w:hAnsi="Bahnschrift" w:cs="Arial"/>
-          <w:sz w:val="24"/>
-          <w:szCs w:val="24"/>
-          <w:rtl/>
-          <w:lang w:bidi="ar-EG"/>
-        </w:rPr>
-      </w:pPr>
-      <w:r>
-        <w:rPr>
-          <w:rFonts w:ascii="Bahnschrift" w:hAnsi="Bahnschrift" w:cs="Arial"/>
-          <w:sz w:val="24"/>
-          <w:szCs w:val="24"/>
-          <w:lang w:bidi="ar-EG"/>
-        </w:rPr>
-        <w:t>• The system must support role-based access control.</w:t>
-      </w:r>
-    </w:p>
-    <w:p>
-      <w:pPr>
-        <w:rPr>
-          <w:rFonts w:ascii="Bahnschrift" w:hAnsi="Bahnschrift" w:cs="Arial"/>
-          <w:sz w:val="24"/>
-          <w:szCs w:val="24"/>
-          <w:lang w:bidi="ar-EG"/>
-        </w:rPr>
-      </w:pPr>
-      <w:r>
-        <w:rPr>
-          <w:rFonts w:ascii="Bahnschrift" w:hAnsi="Bahnschrift" w:cs="Arial"/>
-          <w:sz w:val="24"/>
-          <w:szCs w:val="24"/>
-          <w:lang w:bidi="ar-EG"/>
-        </w:rPr>
-        <w:t>• The AI-based features depend on external Artificial Intelligence services for content analysis, quiz generation, and performance analytics.</w:t>
-      </w:r>
-    </w:p>
-    <w:p>
-      <w:pPr>
-        <w:rPr>
-          <w:rFonts w:ascii="Bahnschrift" w:hAnsi="Bahnschrift" w:cs="Arial"/>
-          <w:sz w:val="24"/>
-          <w:szCs w:val="24"/>
-          <w:lang w:bidi="ar-EG"/>
-        </w:rPr>
-      </w:pPr>
-      <w:r>
-        <w:rPr>
-          <w:rFonts w:ascii="Bahnschrift" w:hAnsi="Bahnschrift" w:cs="Arial"/>
-          <w:sz w:val="24"/>
-          <w:szCs w:val="24"/>
-          <w:lang w:bidi="ar-EG"/>
-        </w:rPr>
-        <w:t>• Availability and accuracy of AI-generated outputs are subject to the limitations and response quality of third-party AI service providers.</w:t>
-      </w:r>
-    </w:p>
-    <w:p>
-      <w:pPr>
-        <w:rPr>
-          <w:rFonts w:ascii="Bahnschrift" w:hAnsi="Bahnschrift" w:cs="Arial"/>
-          <w:b/>
-          <w:bCs/>
-          <w:sz w:val="28"/>
-          <w:szCs w:val="28"/>
-          <w:lang w:bidi="ar-EG"/>
-        </w:rPr>
-      </w:pPr>
-      <w:r>
-        <w:rPr>
-          <w:rFonts w:ascii="Bahnschrift" w:hAnsi="Bahnschrift" w:cs="Arial"/>
-          <w:b/>
-          <w:bCs/>
-          <w:sz w:val="28"/>
-          <w:szCs w:val="28"/>
-          <w:lang w:bidi="ar-EG"/>
-        </w:rPr>
-        <w:t>2.6 Project Documentation</w:t>
-      </w:r>
-    </w:p>
-    <w:p>
-      <w:pPr>
-        <w:rPr>
-          <w:rFonts w:ascii="Bahnschrift" w:hAnsi="Bahnschrift" w:cs="Arial"/>
-          <w:sz w:val="24"/>
-          <w:szCs w:val="24"/>
-          <w:lang w:bidi="ar-EG"/>
-        </w:rPr>
-      </w:pPr>
-      <w:r>
-        <w:rPr>
-          <w:rFonts w:ascii="Bahnschrift" w:hAnsi="Bahnschrift" w:cs="Arial"/>
-          <w:sz w:val="24"/>
-          <w:szCs w:val="24"/>
-          <w:lang w:bidi="ar-EG"/>
-        </w:rPr>
-        <w:t xml:space="preserve">The following documents are produced as part of the </w:t>
-      </w:r>
-      <w:proofErr w:type="spellStart"/>
-      <w:r>
-        <w:rPr>
-          <w:rFonts w:ascii="Bahnschrift" w:hAnsi="Bahnschrift" w:cs="Arial"/>
-          <w:sz w:val="24"/>
-          <w:szCs w:val="24"/>
-          <w:lang w:bidi="ar-EG"/>
-        </w:rPr>
-        <w:t>Athary</w:t>
-      </w:r>
-      <w:proofErr w:type="spellEnd"/>
-      <w:r>
-        <w:rPr>
-          <w:rFonts w:ascii="Bahnschrift" w:hAnsi="Bahnschrift" w:cs="Arial"/>
-          <w:sz w:val="24"/>
-          <w:szCs w:val="24"/>
-          <w:lang w:bidi="ar-EG"/>
-        </w:rPr>
-        <w:t xml:space="preserve"> project:</w:t>
-      </w:r>
-    </w:p>
-    <w:p>
-      <w:pPr>
-        <w:rPr>
-          <w:rFonts w:ascii="Bahnschrift" w:hAnsi="Bahnschrift" w:cs="Arial"/>
-          <w:sz w:val="24"/>
-          <w:szCs w:val="24"/>
-          <w:lang w:bidi="ar-EG"/>
-        </w:rPr>
-      </w:pPr>
-      <w:r>
-        <w:rPr>
-          <w:rFonts w:ascii="Bahnschrift" w:hAnsi="Bahnschrift" w:cs="Arial"/>
-          <w:sz w:val="24"/>
-          <w:szCs w:val="24"/>
-          <w:lang w:bidi="ar-EG"/>
-        </w:rPr>
-        <w:t>• Software Requirements Specification (SRS)</w:t>
-      </w:r>
-    </w:p>
-    <w:p>
-      <w:pPr>
-        <w:rPr>
-          <w:rFonts w:ascii="Bahnschrift" w:hAnsi="Bahnschrift" w:cs="Arial"/>
-          <w:sz w:val="24"/>
-          <w:szCs w:val="24"/>
-          <w:lang w:bidi="ar-EG"/>
-        </w:rPr>
-      </w:pPr>
-      <w:r>
-        <w:rPr>
-          <w:rFonts w:ascii="Bahnschrift" w:hAnsi="Bahnschrift" w:cs="Arial"/>
-          <w:sz w:val="24"/>
-          <w:szCs w:val="24"/>
-          <w:lang w:bidi="ar-EG"/>
-        </w:rPr>
-        <w:t>• Use Case Specification Document</w:t>
-      </w:r>
-    </w:p>
-    <w:p>
-      <w:pPr>
-        <w:rPr>
-          <w:rFonts w:ascii="Bahnschrift" w:hAnsi="Bahnschrift" w:cs="Arial"/>
-          <w:sz w:val="24"/>
-          <w:szCs w:val="24"/>
-          <w:lang w:bidi="ar-EG"/>
-        </w:rPr>
-      </w:pPr>
-      <w:r>
-        <w:rPr>
-          <w:rFonts w:ascii="Bahnschrift" w:hAnsi="Bahnschrift" w:cs="Arial"/>
-          <w:sz w:val="24"/>
-          <w:szCs w:val="24"/>
-          <w:lang w:bidi="ar-EG"/>
-        </w:rPr>
-        <w:t>• Database Design Document</w:t>
-      </w:r>
-    </w:p>
-    <w:p>
-      <w:pPr>
-        <w:rPr>
-          <w:rFonts w:ascii="Bahnschrift" w:hAnsi="Bahnschrift" w:cs="Arial"/>
-          <w:sz w:val="24"/>
-          <w:szCs w:val="24"/>
-          <w:lang w:bidi="ar-EG"/>
-        </w:rPr>
-      </w:pPr>
-      <w:r>
-        <w:rPr>
-          <w:rFonts w:ascii="Bahnschrift" w:hAnsi="Bahnschrift" w:cs="Arial"/>
-          <w:sz w:val="24"/>
-          <w:szCs w:val="24"/>
-          <w:lang w:bidi="ar-EG"/>
-        </w:rPr>
-        <w:t>• System Architecture Diagram</w:t>
-      </w:r>
-    </w:p>
-    <w:p>
-      <w:pPr>
-        <w:rPr>
-          <w:rFonts w:ascii="Bahnschrift" w:hAnsi="Bahnschrift" w:cs="Arial"/>
-          <w:b/>
-          <w:bCs/>
-          <w:sz w:val="28"/>
-          <w:szCs w:val="28"/>
-          <w:lang w:bidi="ar-EG"/>
-        </w:rPr>
-      </w:pPr>
-      <w:r>
-        <w:rPr>
-          <w:rFonts w:ascii="Bahnschrift" w:hAnsi="Bahnschrift" w:cs="Arial"/>
-          <w:b/>
-          <w:bCs/>
-          <w:sz w:val="28"/>
-          <w:szCs w:val="28"/>
-          <w:lang w:bidi="ar-EG"/>
-        </w:rPr>
         <w:lastRenderedPageBreak/>
         <w:t>2.7 User Documentation</w:t>
       </w:r>
@@ -5244,10 +5410,8 @@
       <w:pPr>
         <w:rPr>
           <w:rFonts w:ascii="Bahnschrift" w:hAnsi="Bahnschrift" w:cs="Arial"/>
-          <w:b/>
-          <w:bCs/>
-          <w:sz w:val="28"/>
-          <w:szCs w:val="28"/>
+          <w:sz w:val="24"/>
+          <w:szCs w:val="24"/>
           <w:lang w:bidi="ar-EG"/>
         </w:rPr>
       </w:pPr>
@@ -5396,7 +5560,7 @@
 </file>
 
 <file path=word/endnotes.xml><?xml version="1.0" encoding="utf-8"?>
-<w:endnotes xmlns:wpc="http://schemas.microsoft.com/office/word/2010/wordprocessingCanvas" xmlns:cx="http://schemas.microsoft.com/office/drawing/2014/chartex" xmlns:cx1="http://schemas.microsoft.com/office/drawing/2015/9/8/chartex" xmlns:cx2="http://schemas.microsoft.com/office/drawing/2015/10/21/chartex" xmlns:cx3="http://schemas.microsoft.com/office/drawing/2016/5/9/chartex" xmlns:cx4="http://schemas.microsoft.com/office/drawing/2016/5/10/chartex" xmlns:cx5="http://schemas.microsoft.com/office/drawing/2016/5/11/chartex" xmlns:cx6="http://schemas.microsoft.com/office/drawing/2016/5/12/chartex" xmlns:cx7="http://schemas.microsoft.com/office/drawing/2016/5/13/chartex" xmlns:cx8="http://schemas.microsoft.com/office/drawing/2016/5/14/chartex" xmlns:mc="http://schemas.openxmlformats.org/markup-compatibility/2006" xmlns:aink="http://schemas.microsoft.com/office/drawing/2016/ink" xmlns:am3d="http://schemas.microsoft.com/office/drawing/2017/model3d" xmlns:o="urn:schemas-microsoft-com:office:office" xmlns:r="http://schemas.openxmlformats.org/officeDocument/2006/relationships" xmlns:m="http://schemas.openxmlformats.org/officeDocument/2006/math" xmlns:v="urn:schemas-microsoft-com:vml" xmlns:wp14="http://schemas.microsoft.com/office/word/2010/wordprocessingDrawing" xmlns:wp="http://schemas.openxmlformats.org/drawingml/2006/wordprocessingDrawing" xmlns:w10="urn:schemas-microsoft-com:office:word" xmlns:w="http://schemas.openxmlformats.org/wordprocessingml/2006/main" xmlns:w14="http://schemas.microsoft.com/office/word/2010/wordml" xmlns:w15="http://schemas.microsoft.com/office/word/2012/wordml" xmlns:w16cex="http://schemas.microsoft.com/office/word/2018/wordml/cex" xmlns:w16cid="http://schemas.microsoft.com/office/word/2016/wordml/cid" xmlns:w16="http://schemas.microsoft.com/office/word/2018/wordml" xmlns:w16se="http://schemas.microsoft.com/office/word/2015/wordml/symex" xmlns:wpg="http://schemas.microsoft.com/office/word/2010/wordprocessingGroup" xmlns:wpi="http://schemas.microsoft.com/office/word/2010/wordprocessingInk" xmlns:wne="http://schemas.microsoft.com/office/word/2006/wordml" xmlns:wps="http://schemas.microsoft.com/office/word/2010/wordprocessingShape" mc:Ignorable="w14 w15 w16se w16cid w16 w16cex wp14">
+<w:endnotes xmlns:wpc="http://schemas.microsoft.com/office/word/2010/wordprocessingCanvas" xmlns:cx="http://schemas.microsoft.com/office/drawing/2014/chartex" xmlns:cx1="http://schemas.microsoft.com/office/drawing/2015/9/8/chartex" xmlns:mc="http://schemas.openxmlformats.org/markup-compatibility/2006" xmlns:o="urn:schemas-microsoft-com:office:office" xmlns:r="http://schemas.openxmlformats.org/officeDocument/2006/relationships" xmlns:m="http://schemas.openxmlformats.org/officeDocument/2006/math" xmlns:v="urn:schemas-microsoft-com:vml" xmlns:wp14="http://schemas.microsoft.com/office/word/2010/wordprocessingDrawing" xmlns:wp="http://schemas.openxmlformats.org/drawingml/2006/wordprocessingDrawing" xmlns:w10="urn:schemas-microsoft-com:office:word" xmlns:w="http://schemas.openxmlformats.org/wordprocessingml/2006/main" xmlns:w14="http://schemas.microsoft.com/office/word/2010/wordml" xmlns:w15="http://schemas.microsoft.com/office/word/2012/wordml" xmlns:w16se="http://schemas.microsoft.com/office/word/2015/wordml/symex" xmlns:wpg="http://schemas.microsoft.com/office/word/2010/wordprocessingGroup" xmlns:wpi="http://schemas.microsoft.com/office/word/2010/wordprocessingInk" xmlns:wne="http://schemas.microsoft.com/office/word/2006/wordml" xmlns:wps="http://schemas.microsoft.com/office/word/2010/wordprocessingShape" mc:Ignorable="w14 w15 w16se wp14">
   <w:endnote w:type="separator" w:id="-1">
     <w:p>
       <w:pPr>
@@ -5421,7 +5585,7 @@
 </file>
 
 <file path=word/footer1.xml><?xml version="1.0" encoding="utf-8"?>
-<w:ftr xmlns:wpc="http://schemas.microsoft.com/office/word/2010/wordprocessingCanvas" xmlns:cx="http://schemas.microsoft.com/office/drawing/2014/chartex" xmlns:cx1="http://schemas.microsoft.com/office/drawing/2015/9/8/chartex" xmlns:cx2="http://schemas.microsoft.com/office/drawing/2015/10/21/chartex" xmlns:cx3="http://schemas.microsoft.com/office/drawing/2016/5/9/chartex" xmlns:cx4="http://schemas.microsoft.com/office/drawing/2016/5/10/chartex" xmlns:cx5="http://schemas.microsoft.com/office/drawing/2016/5/11/chartex" xmlns:cx6="http://schemas.microsoft.com/office/drawing/2016/5/12/chartex" xmlns:cx7="http://schemas.microsoft.com/office/drawing/2016/5/13/chartex" xmlns:cx8="http://schemas.microsoft.com/office/drawing/2016/5/14/chartex" xmlns:mc="http://schemas.openxmlformats.org/markup-compatibility/2006" xmlns:aink="http://schemas.microsoft.com/office/drawing/2016/ink" xmlns:am3d="http://schemas.microsoft.com/office/drawing/2017/model3d" xmlns:o="urn:schemas-microsoft-com:office:office" xmlns:r="http://schemas.openxmlformats.org/officeDocument/2006/relationships" xmlns:m="http://schemas.openxmlformats.org/officeDocument/2006/math" xmlns:v="urn:schemas-microsoft-com:vml" xmlns:wp14="http://schemas.microsoft.com/office/word/2010/wordprocessingDrawing" xmlns:wp="http://schemas.openxmlformats.org/drawingml/2006/wordprocessingDrawing" xmlns:w10="urn:schemas-microsoft-com:office:word" xmlns:w="http://schemas.openxmlformats.org/wordprocessingml/2006/main" xmlns:w14="http://schemas.microsoft.com/office/word/2010/wordml" xmlns:w15="http://schemas.microsoft.com/office/word/2012/wordml" xmlns:w16cex="http://schemas.microsoft.com/office/word/2018/wordml/cex" xmlns:w16cid="http://schemas.microsoft.com/office/word/2016/wordml/cid" xmlns:w16="http://schemas.microsoft.com/office/word/2018/wordml" xmlns:w16se="http://schemas.microsoft.com/office/word/2015/wordml/symex" xmlns:wpg="http://schemas.microsoft.com/office/word/2010/wordprocessingGroup" xmlns:wpi="http://schemas.microsoft.com/office/word/2010/wordprocessingInk" xmlns:wne="http://schemas.microsoft.com/office/word/2006/wordml" xmlns:wps="http://schemas.microsoft.com/office/word/2010/wordprocessingShape" mc:Ignorable="w14 w15 w16se w16cid w16 w16cex wp14">
+<w:ftr xmlns:wpc="http://schemas.microsoft.com/office/word/2010/wordprocessingCanvas" xmlns:cx="http://schemas.microsoft.com/office/drawing/2014/chartex" xmlns:cx1="http://schemas.microsoft.com/office/drawing/2015/9/8/chartex" xmlns:mc="http://schemas.openxmlformats.org/markup-compatibility/2006" xmlns:o="urn:schemas-microsoft-com:office:office" xmlns:r="http://schemas.openxmlformats.org/officeDocument/2006/relationships" xmlns:m="http://schemas.openxmlformats.org/officeDocument/2006/math" xmlns:v="urn:schemas-microsoft-com:vml" xmlns:wp14="http://schemas.microsoft.com/office/word/2010/wordprocessingDrawing" xmlns:wp="http://schemas.openxmlformats.org/drawingml/2006/wordprocessingDrawing" xmlns:w10="urn:schemas-microsoft-com:office:word" xmlns:w="http://schemas.openxmlformats.org/wordprocessingml/2006/main" xmlns:w14="http://schemas.microsoft.com/office/word/2010/wordml" xmlns:w15="http://schemas.microsoft.com/office/word/2012/wordml" xmlns:w16se="http://schemas.microsoft.com/office/word/2015/wordml/symex" xmlns:wpg="http://schemas.microsoft.com/office/word/2010/wordprocessingGroup" xmlns:wpi="http://schemas.microsoft.com/office/word/2010/wordprocessingInk" xmlns:wne="http://schemas.microsoft.com/office/word/2006/wordml" xmlns:wps="http://schemas.microsoft.com/office/word/2010/wordprocessingShape" mc:Ignorable="w14 w15 w16se wp14">
   <w:sdt>
     <w:sdtPr>
       <w:id w:val="-1204320620"/>
@@ -5474,7 +5638,7 @@
             <w:bCs/>
             <w:noProof/>
           </w:rPr>
-          <w:t>2</w:t>
+          <w:t>9</w:t>
         </w:r>
         <w:r>
           <w:rPr>
@@ -5500,7 +5664,7 @@
 </file>
 
 <file path=word/footnotes.xml><?xml version="1.0" encoding="utf-8"?>
-<w:footnotes xmlns:wpc="http://schemas.microsoft.com/office/word/2010/wordprocessingCanvas" xmlns:cx="http://schemas.microsoft.com/office/drawing/2014/chartex" xmlns:cx1="http://schemas.microsoft.com/office/drawing/2015/9/8/chartex" xmlns:cx2="http://schemas.microsoft.com/office/drawing/2015/10/21/chartex" xmlns:cx3="http://schemas.microsoft.com/office/drawing/2016/5/9/chartex" xmlns:cx4="http://schemas.microsoft.com/office/drawing/2016/5/10/chartex" xmlns:cx5="http://schemas.microsoft.com/office/drawing/2016/5/11/chartex" xmlns:cx6="http://schemas.microsoft.com/office/drawing/2016/5/12/chartex" xmlns:cx7="http://schemas.microsoft.com/office/drawing/2016/5/13/chartex" xmlns:cx8="http://schemas.microsoft.com/office/drawing/2016/5/14/chartex" xmlns:mc="http://schemas.openxmlformats.org/markup-compatibility/2006" xmlns:aink="http://schemas.microsoft.com/office/drawing/2016/ink" xmlns:am3d="http://schemas.microsoft.com/office/drawing/2017/model3d" xmlns:o="urn:schemas-microsoft-com:office:office" xmlns:r="http://schemas.openxmlformats.org/officeDocument/2006/relationships" xmlns:m="http://schemas.openxmlformats.org/officeDocument/2006/math" xmlns:v="urn:schemas-microsoft-com:vml" xmlns:wp14="http://schemas.microsoft.com/office/word/2010/wordprocessingDrawing" xmlns:wp="http://schemas.openxmlformats.org/drawingml/2006/wordprocessingDrawing" xmlns:w10="urn:schemas-microsoft-com:office:word" xmlns:w="http://schemas.openxmlformats.org/wordprocessingml/2006/main" xmlns:w14="http://schemas.microsoft.com/office/word/2010/wordml" xmlns:w15="http://schemas.microsoft.com/office/word/2012/wordml" xmlns:w16cex="http://schemas.microsoft.com/office/word/2018/wordml/cex" xmlns:w16cid="http://schemas.microsoft.com/office/word/2016/wordml/cid" xmlns:w16="http://schemas.microsoft.com/office/word/2018/wordml" xmlns:w16se="http://schemas.microsoft.com/office/word/2015/wordml/symex" xmlns:wpg="http://schemas.microsoft.com/office/word/2010/wordprocessingGroup" xmlns:wpi="http://schemas.microsoft.com/office/word/2010/wordprocessingInk" xmlns:wne="http://schemas.microsoft.com/office/word/2006/wordml" xmlns:wps="http://schemas.microsoft.com/office/word/2010/wordprocessingShape" mc:Ignorable="w14 w15 w16se w16cid w16 w16cex wp14">
+<w:footnotes xmlns:wpc="http://schemas.microsoft.com/office/word/2010/wordprocessingCanvas" xmlns:cx="http://schemas.microsoft.com/office/drawing/2014/chartex" xmlns:cx1="http://schemas.microsoft.com/office/drawing/2015/9/8/chartex" xmlns:mc="http://schemas.openxmlformats.org/markup-compatibility/2006" xmlns:o="urn:schemas-microsoft-com:office:office" xmlns:r="http://schemas.openxmlformats.org/officeDocument/2006/relationships" xmlns:m="http://schemas.openxmlformats.org/officeDocument/2006/math" xmlns:v="urn:schemas-microsoft-com:vml" xmlns:wp14="http://schemas.microsoft.com/office/word/2010/wordprocessingDrawing" xmlns:wp="http://schemas.openxmlformats.org/drawingml/2006/wordprocessingDrawing" xmlns:w10="urn:schemas-microsoft-com:office:word" xmlns:w="http://schemas.openxmlformats.org/wordprocessingml/2006/main" xmlns:w14="http://schemas.microsoft.com/office/word/2010/wordml" xmlns:w15="http://schemas.microsoft.com/office/word/2012/wordml" xmlns:w16se="http://schemas.microsoft.com/office/word/2015/wordml/symex" xmlns:wpg="http://schemas.microsoft.com/office/word/2010/wordprocessingGroup" xmlns:wpi="http://schemas.microsoft.com/office/word/2010/wordprocessingInk" xmlns:wne="http://schemas.microsoft.com/office/word/2006/wordml" xmlns:wps="http://schemas.microsoft.com/office/word/2010/wordprocessingShape" mc:Ignorable="w14 w15 w16se wp14">
   <w:footnote w:type="separator" w:id="-1">
     <w:p>
       <w:pPr>
@@ -5525,7 +5689,7 @@
 </file>
 
 <file path=word/numbering.xml><?xml version="1.0" encoding="utf-8"?>
-<w:numbering xmlns:wpc="http://schemas.microsoft.com/office/word/2010/wordprocessingCanvas" xmlns:cx="http://schemas.microsoft.com/office/drawing/2014/chartex" xmlns:cx1="http://schemas.microsoft.com/office/drawing/2015/9/8/chartex" xmlns:cx2="http://schemas.microsoft.com/office/drawing/2015/10/21/chartex" xmlns:cx3="http://schemas.microsoft.com/office/drawing/2016/5/9/chartex" xmlns:cx4="http://schemas.microsoft.com/office/drawing/2016/5/10/chartex" xmlns:cx5="http://schemas.microsoft.com/office/drawing/2016/5/11/chartex" xmlns:cx6="http://schemas.microsoft.com/office/drawing/2016/5/12/chartex" xmlns:cx7="http://schemas.microsoft.com/office/drawing/2016/5/13/chartex" xmlns:cx8="http://schemas.microsoft.com/office/drawing/2016/5/14/chartex" xmlns:mc="http://schemas.openxmlformats.org/markup-compatibility/2006" xmlns:aink="http://schemas.microsoft.com/office/drawing/2016/ink" xmlns:am3d="http://schemas.microsoft.com/office/drawing/2017/model3d" xmlns:o="urn:schemas-microsoft-com:office:office" xmlns:r="http://schemas.openxmlformats.org/officeDocument/2006/relationships" xmlns:m="http://schemas.openxmlformats.org/officeDocument/2006/math" xmlns:v="urn:schemas-microsoft-com:vml" xmlns:wp14="http://schemas.microsoft.com/office/word/2010/wordprocessingDrawing" xmlns:wp="http://schemas.openxmlformats.org/drawingml/2006/wordprocessingDrawing" xmlns:w10="urn:schemas-microsoft-com:office:word" xmlns:w="http://schemas.openxmlformats.org/wordprocessingml/2006/main" xmlns:w14="http://schemas.microsoft.com/office/word/2010/wordml" xmlns:w15="http://schemas.microsoft.com/office/word/2012/wordml" xmlns:w16cex="http://schemas.microsoft.com/office/word/2018/wordml/cex" xmlns:w16cid="http://schemas.microsoft.com/office/word/2016/wordml/cid" xmlns:w16="http://schemas.microsoft.com/office/word/2018/wordml" xmlns:w16se="http://schemas.microsoft.com/office/word/2015/wordml/symex" xmlns:wpg="http://schemas.microsoft.com/office/word/2010/wordprocessingGroup" xmlns:wpi="http://schemas.microsoft.com/office/word/2010/wordprocessingInk" xmlns:wne="http://schemas.microsoft.com/office/word/2006/wordml" xmlns:wps="http://schemas.microsoft.com/office/word/2010/wordprocessingShape" mc:Ignorable="w14 w15 w16se w16cid w16 w16cex wp14">
+<w:numbering xmlns:wpc="http://schemas.microsoft.com/office/word/2010/wordprocessingCanvas" xmlns:cx="http://schemas.microsoft.com/office/drawing/2014/chartex" xmlns:cx1="http://schemas.microsoft.com/office/drawing/2015/9/8/chartex" xmlns:mc="http://schemas.openxmlformats.org/markup-compatibility/2006" xmlns:o="urn:schemas-microsoft-com:office:office" xmlns:r="http://schemas.openxmlformats.org/officeDocument/2006/relationships" xmlns:m="http://schemas.openxmlformats.org/officeDocument/2006/math" xmlns:v="urn:schemas-microsoft-com:vml" xmlns:wp14="http://schemas.microsoft.com/office/word/2010/wordprocessingDrawing" xmlns:wp="http://schemas.openxmlformats.org/drawingml/2006/wordprocessingDrawing" xmlns:w10="urn:schemas-microsoft-com:office:word" xmlns:w="http://schemas.openxmlformats.org/wordprocessingml/2006/main" xmlns:w14="http://schemas.microsoft.com/office/word/2010/wordml" xmlns:w15="http://schemas.microsoft.com/office/word/2012/wordml" xmlns:w16se="http://schemas.microsoft.com/office/word/2015/wordml/symex" xmlns:wpg="http://schemas.microsoft.com/office/word/2010/wordprocessingGroup" xmlns:wpi="http://schemas.microsoft.com/office/word/2010/wordprocessingInk" xmlns:wne="http://schemas.microsoft.com/office/word/2006/wordml" xmlns:wps="http://schemas.microsoft.com/office/word/2010/wordprocessingShape" mc:Ignorable="w14 w15 w16se wp14">
   <w:abstractNum w:abstractNumId="0" w15:restartNumberingAfterBreak="0">
     <w:nsid w:val="05857796"/>
     <w:multiLevelType w:val="multilevel"/>
@@ -7474,7 +7638,7 @@
 </file>
 
 <file path=word/styles.xml><?xml version="1.0" encoding="utf-8"?>
-<w:styles xmlns:mc="http://schemas.openxmlformats.org/markup-compatibility/2006" xmlns:r="http://schemas.openxmlformats.org/officeDocument/2006/relationships" xmlns:w="http://schemas.openxmlformats.org/wordprocessingml/2006/main" xmlns:w14="http://schemas.microsoft.com/office/word/2010/wordml" xmlns:w15="http://schemas.microsoft.com/office/word/2012/wordml" xmlns:w16cex="http://schemas.microsoft.com/office/word/2018/wordml/cex" xmlns:w16cid="http://schemas.microsoft.com/office/word/2016/wordml/cid" xmlns:w16="http://schemas.microsoft.com/office/word/2018/wordml" xmlns:w16se="http://schemas.microsoft.com/office/word/2015/wordml/symex" mc:Ignorable="w14 w15 w16se w16cid w16 w16cex">
+<w:styles xmlns:mc="http://schemas.openxmlformats.org/markup-compatibility/2006" xmlns:r="http://schemas.openxmlformats.org/officeDocument/2006/relationships" xmlns:w="http://schemas.openxmlformats.org/wordprocessingml/2006/main" xmlns:w14="http://schemas.microsoft.com/office/word/2010/wordml" xmlns:w15="http://schemas.microsoft.com/office/word/2012/wordml" xmlns:w16se="http://schemas.microsoft.com/office/word/2015/wordml/symex" mc:Ignorable="w14 w15 w16se">
   <w:docDefaults>
     <w:rPrDefault>
       <w:rPr>
@@ -7490,7 +7654,7 @@
       </w:pPr>
     </w:pPrDefault>
   </w:docDefaults>
-  <w:latentStyles w:defLockedState="0" w:defUIPriority="99" w:defSemiHidden="0" w:defUnhideWhenUsed="0" w:defQFormat="0" w:count="376">
+  <w:latentStyles w:defLockedState="0" w:defUIPriority="99" w:defSemiHidden="0" w:defUnhideWhenUsed="0" w:defQFormat="0" w:count="371">
     <w:lsdException w:name="Normal" w:uiPriority="0" w:qFormat="1"/>
     <w:lsdException w:name="heading 1" w:uiPriority="9" w:qFormat="1"/>
     <w:lsdException w:name="heading 2" w:semiHidden="1" w:uiPriority="9" w:unhideWhenUsed="1" w:qFormat="1"/>
@@ -7862,11 +8026,6 @@
     <w:lsdException w:name="List Table 5 Dark Accent 6" w:uiPriority="50"/>
     <w:lsdException w:name="List Table 6 Colorful Accent 6" w:uiPriority="51"/>
     <w:lsdException w:name="List Table 7 Colorful Accent 6" w:uiPriority="52"/>
-    <w:lsdException w:name="Mention" w:semiHidden="1" w:unhideWhenUsed="1"/>
-    <w:lsdException w:name="Smart Hyperlink" w:semiHidden="1" w:unhideWhenUsed="1"/>
-    <w:lsdException w:name="Hashtag" w:semiHidden="1" w:unhideWhenUsed="1"/>
-    <w:lsdException w:name="Unresolved Mention" w:semiHidden="1" w:unhideWhenUsed="1"/>
-    <w:lsdException w:name="Smart Link" w:semiHidden="1" w:unhideWhenUsed="1"/>
   </w:latentStyles>
   <w:style w:type="paragraph" w:default="1" w:styleId="Normal">
     <w:name w:val="Normal"/>

</xml_diff>